<commit_message>
Bổ sung baseline, bộ dữ liệu
</commit_message>
<xml_diff>
--- a/reports/bao_cao_tien_do_online_kg_rag.docx
+++ b/reports/bao_cao_tien_do_online_kg_rag.docx
@@ -133,7 +133,7 @@
         <w:pStyle w:val="Date"/>
       </w:pPr>
       <w:r>
-        <w:t xml:space="preserve">07/09/2026</w:t>
+        <w:t xml:space="preserve">11/09/2026</w:t>
       </w:r>
     </w:p>
     <w:sdt>
@@ -821,9 +821,9 @@
       <w:pPr>
         <w:pStyle w:val="Heading2"/>
       </w:pPr>
-      <w:bookmarkStart w:id="29" w:name="bước-7-thực-thi-path-trên-kg"/>
-      <w:r>
-        <w:t xml:space="preserve">1.9. Bước 7 — Thực thi path trên KG</w:t>
+      <w:bookmarkStart w:id="29" w:name="X6c851b1198a112c3c8e7d712648fef9c18884d1"/>
+      <w:r>
+        <w:t xml:space="preserve">1.9. Bước 7 — Sinh code để thực thi và đánh giá path</w:t>
       </w:r>
       <w:bookmarkEnd w:id="29"/>
     </w:p>
@@ -832,7 +832,64 @@
         <w:pStyle w:val="FirstParagraph"/>
       </w:pPr>
       <w:r>
-        <w:t xml:space="preserve">Mỗi path được chuyển thành một chương trình truy vấn nhỏ. Chương trình chỉ được đọc KG qua các thao tác an toàn như đi từ entity tới giá trị, đi ngược từ giá trị tới entity nguồn, lọc/sắp xếp kết quả và lấy provenance.</w:t>
+        <w:t xml:space="preserve">Đây là thành phần trung tâm nối planner với KG. Reasoning path do planner sinh ra không được chấm điểm chỉ dựa trên mô tả tự nhiên. Với mỗi path,</w:t>
+      </w:r>
+      <w:r>
+        <w:t xml:space="preserve"> </w:t>
+      </w:r>
+      <w:r>
+        <w:rPr>
+          <w:rStyle w:val="VerbatimChar"/>
+        </w:rPr>
+        <w:t xml:space="preserve">CodeSynthesizer</w:t>
+      </w:r>
+      <w:r>
+        <w:t xml:space="preserve"> </w:t>
+      </w:r>
+      <w:r>
+        <w:t xml:space="preserve">gọi LLM để chuyển chuỗi mục tiêu của path thành một chương trình Python nhỏ. Chương trình phải gán kết quả cuối vào biến</w:t>
+      </w:r>
+      <w:r>
+        <w:t xml:space="preserve"> </w:t>
+      </w:r>
+      <w:r>
+        <w:rPr>
+          <w:rStyle w:val="VerbatimChar"/>
+        </w:rPr>
+        <w:t xml:space="preserve">result</w:t>
+      </w:r>
+      <w:r>
+        <w:t xml:space="preserve">; giá trị này phải được suy ra từ các lời gọi API của</w:t>
+      </w:r>
+      <w:r>
+        <w:t xml:space="preserve"> </w:t>
+      </w:r>
+      <w:r>
+        <w:rPr>
+          <w:rStyle w:val="VerbatimChar"/>
+        </w:rPr>
+        <w:t xml:space="preserve">kg</w:t>
+      </w:r>
+      <w:r>
+        <w:t xml:space="preserve">, không được gán cứng từ câu hỏi hoặc từ kiến thức bên ngoài.</w:t>
+      </w:r>
+    </w:p>
+    <w:p>
+      <w:pPr>
+        <w:pStyle w:val="Heading3"/>
+      </w:pPr>
+      <w:bookmarkStart w:id="30" w:name="context-được-đưa-vào-prompt-sinh-code"/>
+      <w:r>
+        <w:t xml:space="preserve">1.9.1. Context được đưa vào prompt sinh code</w:t>
+      </w:r>
+      <w:bookmarkEnd w:id="30"/>
+    </w:p>
+    <w:p>
+      <w:pPr>
+        <w:pStyle w:val="FirstParagraph"/>
+      </w:pPr>
+      <w:r>
+        <w:t xml:space="preserve">Prompt sinh code gồm câu hỏi, các bước của reasoning path và tài liệu API giới hạn của Online KG. Khi có KG, prompt còn cung cấp danh sách entity, các relation hợp lệ và tối đa 100 edge mẫu. Nhờ đó code generator phải lập trình trên graph cụ thể của câu hỏi thay vì tự nghĩ ra relation hoặc entity không tồn tại.</w:t>
       </w:r>
     </w:p>
     <w:p>
@@ -840,33 +897,273 @@
         <w:pStyle w:val="BodyText"/>
       </w:pPr>
       <w:r>
-        <w:t xml:space="preserve">Chương trình chạy trong sandbox, không được truy cập file hoặc mạng. Nếu chương trình lỗi, trả rỗng hoặc không truy cập evidence trong KG, path không được xem là lời giải hợp lệ.</w:t>
-      </w:r>
-    </w:p>
-    <w:p>
-      <w:pPr>
-        <w:pStyle w:val="BodyText"/>
-      </w:pPr>
-      <w:r>
-        <w:t xml:space="preserve">Trong khi thực thi, hệ thống ghi lại các edge thực sự được sử dụng. Nhờ đó, answer của mỗi path có thể được đối chiếu với evidence cụ thể.</w:t>
-      </w:r>
-    </w:p>
-    <w:p>
-      <w:pPr>
-        <w:pStyle w:val="Heading2"/>
-      </w:pPr>
-      <w:bookmarkStart w:id="30" w:name="bước-8-chấm-điểm-grounded-consistency"/>
-      <w:r>
-        <w:t xml:space="preserve">1.10. Bước 8 — Chấm điểm grounded consistency</w:t>
-      </w:r>
-      <w:bookmarkEnd w:id="30"/>
+        <w:t xml:space="preserve">API công khai cho code sinh gồm:</w:t>
+      </w:r>
+    </w:p>
+    <w:p>
+      <w:pPr>
+        <w:pStyle w:val="SourceCode"/>
+      </w:pPr>
+      <w:r>
+        <w:rPr>
+          <w:rStyle w:val="NormalTok"/>
+        </w:rPr>
+        <w:t xml:space="preserve">kg.get_neighbors(entity, relation</w:t>
+      </w:r>
+      <w:r>
+        <w:rPr>
+          <w:rStyle w:val="OperatorTok"/>
+        </w:rPr>
+        <w:t xml:space="preserve">=</w:t>
+      </w:r>
+      <w:r>
+        <w:rPr>
+          <w:rStyle w:val="VariableTok"/>
+        </w:rPr>
+        <w:t xml:space="preserve">None</w:t>
+      </w:r>
+      <w:r>
+        <w:rPr>
+          <w:rStyle w:val="NormalTok"/>
+        </w:rPr>
+        <w:t xml:space="preserve">)  </w:t>
+      </w:r>
+      <w:r>
+        <w:rPr>
+          <w:rStyle w:val="CommentTok"/>
+        </w:rPr>
+        <w:t xml:space="preserve"># đi từ head tới tail</w:t>
+      </w:r>
+      <w:r>
+        <w:br w:type="textWrapping"/>
+      </w:r>
+      <w:r>
+        <w:rPr>
+          <w:rStyle w:val="NormalTok"/>
+        </w:rPr>
+        <w:t xml:space="preserve">kg.get_sources(entity, relation</w:t>
+      </w:r>
+      <w:r>
+        <w:rPr>
+          <w:rStyle w:val="OperatorTok"/>
+        </w:rPr>
+        <w:t xml:space="preserve">=</w:t>
+      </w:r>
+      <w:r>
+        <w:rPr>
+          <w:rStyle w:val="VariableTok"/>
+        </w:rPr>
+        <w:t xml:space="preserve">None</w:t>
+      </w:r>
+      <w:r>
+        <w:rPr>
+          <w:rStyle w:val="NormalTok"/>
+        </w:rPr>
+        <w:t xml:space="preserve">)     </w:t>
+      </w:r>
+      <w:r>
+        <w:rPr>
+          <w:rStyle w:val="CommentTok"/>
+        </w:rPr>
+        <w:t xml:space="preserve"># đi ngược từ tail về head</w:t>
+      </w:r>
+      <w:r>
+        <w:br w:type="textWrapping"/>
+      </w:r>
+      <w:r>
+        <w:rPr>
+          <w:rStyle w:val="NormalTok"/>
+        </w:rPr>
+        <w:t xml:space="preserve">kg.get_relations(entity)</w:t>
+      </w:r>
+      <w:r>
+        <w:br w:type="textWrapping"/>
+      </w:r>
+      <w:r>
+        <w:rPr>
+          <w:rStyle w:val="NormalTok"/>
+        </w:rPr>
+        <w:t xml:space="preserve">kg.</w:t>
+      </w:r>
+      <w:r>
+        <w:rPr>
+          <w:rStyle w:val="BuiltInTok"/>
+        </w:rPr>
+        <w:t xml:space="preserve">filter</w:t>
+      </w:r>
+      <w:r>
+        <w:rPr>
+          <w:rStyle w:val="NormalTok"/>
+        </w:rPr>
+        <w:t xml:space="preserve">(entities, predicate)</w:t>
+      </w:r>
     </w:p>
     <w:p>
       <w:pPr>
         <w:pStyle w:val="FirstParagraph"/>
       </w:pPr>
       <w:r>
-        <w:t xml:space="preserve">Phiên bản hiện tại không chỉ đếm số path trả cùng answer. Một path được ưu tiên khi:</w:t>
+        <w:t xml:space="preserve">Ví dụ, với path</w:t>
+      </w:r>
+      <w:r>
+        <w:t xml:space="preserve"> </w:t>
+      </w:r>
+      <w:r>
+        <w:t xml:space="preserve">“</w:t>
+      </w:r>
+      <w:r>
+        <w:t xml:space="preserve">tìm người có ngày sinh rồi lấy quốc tịch</w:t>
+      </w:r>
+      <w:r>
+        <w:t xml:space="preserve">”</w:t>
+      </w:r>
+      <w:r>
+        <w:t xml:space="preserve">, code có thể thực hiện hai chiều truy vấn:</w:t>
+      </w:r>
+    </w:p>
+    <w:p>
+      <w:pPr>
+        <w:pStyle w:val="SourceCode"/>
+      </w:pPr>
+      <w:r>
+        <w:rPr>
+          <w:rStyle w:val="NormalTok"/>
+        </w:rPr>
+        <w:t xml:space="preserve">people </w:t>
+      </w:r>
+      <w:r>
+        <w:rPr>
+          <w:rStyle w:val="OperatorTok"/>
+        </w:rPr>
+        <w:t xml:space="preserve">=</w:t>
+      </w:r>
+      <w:r>
+        <w:rPr>
+          <w:rStyle w:val="NormalTok"/>
+        </w:rPr>
+        <w:t xml:space="preserve"> kg.get_sources(</w:t>
+      </w:r>
+      <w:r>
+        <w:rPr>
+          <w:rStyle w:val="StringTok"/>
+        </w:rPr>
+        <w:t xml:space="preserve">"15 February 1968"</w:t>
+      </w:r>
+      <w:r>
+        <w:rPr>
+          <w:rStyle w:val="NormalTok"/>
+        </w:rPr>
+        <w:t xml:space="preserve">, </w:t>
+      </w:r>
+      <w:r>
+        <w:rPr>
+          <w:rStyle w:val="StringTok"/>
+        </w:rPr>
+        <w:t xml:space="preserve">"birth_date"</w:t>
+      </w:r>
+      <w:r>
+        <w:rPr>
+          <w:rStyle w:val="NormalTok"/>
+        </w:rPr>
+        <w:t xml:space="preserve">)</w:t>
+      </w:r>
+      <w:r>
+        <w:br w:type="textWrapping"/>
+      </w:r>
+      <w:r>
+        <w:rPr>
+          <w:rStyle w:val="NormalTok"/>
+        </w:rPr>
+        <w:t xml:space="preserve">result </w:t>
+      </w:r>
+      <w:r>
+        <w:rPr>
+          <w:rStyle w:val="OperatorTok"/>
+        </w:rPr>
+        <w:t xml:space="preserve">=</w:t>
+      </w:r>
+      <w:r>
+        <w:rPr>
+          <w:rStyle w:val="NormalTok"/>
+        </w:rPr>
+        <w:t xml:space="preserve"> kg.get_neighbors(people[</w:t>
+      </w:r>
+      <w:r>
+        <w:rPr>
+          <w:rStyle w:val="DecValTok"/>
+        </w:rPr>
+        <w:t xml:space="preserve">0</w:t>
+      </w:r>
+      <w:r>
+        <w:rPr>
+          <w:rStyle w:val="NormalTok"/>
+        </w:rPr>
+        <w:t xml:space="preserve">], </w:t>
+      </w:r>
+      <w:r>
+        <w:rPr>
+          <w:rStyle w:val="StringTok"/>
+        </w:rPr>
+        <w:t xml:space="preserve">"nationality"</w:t>
+      </w:r>
+      <w:r>
+        <w:rPr>
+          <w:rStyle w:val="NormalTok"/>
+        </w:rPr>
+        <w:t xml:space="preserve">)</w:t>
+      </w:r>
+    </w:p>
+    <w:p>
+      <w:pPr>
+        <w:pStyle w:val="FirstParagraph"/>
+      </w:pPr>
+      <w:r>
+        <w:t xml:space="preserve">Điểm quan trọng là code không chỉ mô tả path mà thực sự buộc path phải đi qua các edge đang có trong KG. Với quan hệ ngược, generator phải dùng</w:t>
+      </w:r>
+      <w:r>
+        <w:t xml:space="preserve"> </w:t>
+      </w:r>
+      <w:r>
+        <w:rPr>
+          <w:rStyle w:val="VerbatimChar"/>
+        </w:rPr>
+        <w:t xml:space="preserve">get_sources</w:t>
+      </w:r>
+      <w:r>
+        <w:t xml:space="preserve">; dùng</w:t>
+      </w:r>
+      <w:r>
+        <w:t xml:space="preserve"> </w:t>
+      </w:r>
+      <w:r>
+        <w:rPr>
+          <w:rStyle w:val="VerbatimChar"/>
+        </w:rPr>
+        <w:t xml:space="preserve">get_neighbors</w:t>
+      </w:r>
+      <w:r>
+        <w:t xml:space="preserve"> </w:t>
+      </w:r>
+      <w:r>
+        <w:t xml:space="preserve">sai hướng sẽ bị phát hiện trước khi chạy.</w:t>
+      </w:r>
+    </w:p>
+    <w:p>
+      <w:pPr>
+        <w:pStyle w:val="Heading3"/>
+      </w:pPr>
+      <w:bookmarkStart w:id="31" w:name="kiểm-tra-và-retry-code"/>
+      <w:r>
+        <w:t xml:space="preserve">1.9.2. Kiểm tra và retry code</w:t>
+      </w:r>
+      <w:bookmarkEnd w:id="31"/>
+    </w:p>
+    <w:p>
+      <w:pPr>
+        <w:pStyle w:val="FirstParagraph"/>
+      </w:pPr>
+      <w:r>
+        <w:t xml:space="preserve">Code do LLM sinh được kiểm tra theo hai lớp:</w:t>
       </w:r>
     </w:p>
     <w:p>
@@ -878,7 +1175,31 @@
         </w:numPr>
       </w:pPr>
       <w:r>
-        <w:t xml:space="preserve">thực thi thành công và kết quả không rỗng;</w:t>
+        <w:rPr>
+          <w:b/>
+        </w:rPr>
+        <w:t xml:space="preserve">Kiểm tra cú pháp và cấu trúc:</w:t>
+      </w:r>
+      <w:r>
+        <w:t xml:space="preserve"> </w:t>
+      </w:r>
+      <w:r>
+        <w:t xml:space="preserve">code phải compile được, phải có biến</w:t>
+      </w:r>
+      <w:r>
+        <w:t xml:space="preserve"> </w:t>
+      </w:r>
+      <w:r>
+        <w:rPr>
+          <w:rStyle w:val="VerbatimChar"/>
+        </w:rPr>
+        <w:t xml:space="preserve">result</w:t>
+      </w:r>
+      <w:r>
+        <w:t xml:space="preserve"> </w:t>
+      </w:r>
+      <w:r>
+        <w:t xml:space="preserve">và không được rỗng.</w:t>
       </w:r>
     </w:p>
     <w:p>
@@ -890,54 +1211,695 @@
         </w:numPr>
       </w:pPr>
       <w:r>
-        <w:t xml:space="preserve">answer được nối trực tiếp hoặc suy ra từ các edge đã truy cập;</w:t>
+        <w:rPr>
+          <w:b/>
+        </w:rPr>
+        <w:t xml:space="preserve">Kiểm tra ngữ nghĩa tĩnh:</w:t>
+      </w:r>
+      <w:r>
+        <w:t xml:space="preserve"> </w:t>
+      </w:r>
+      <w:r>
+        <w:t xml:space="preserve">chỉ chấp nhận các method trong API của KG, giới hạn số lượng và tên keyword, relation literal phải tồn tại trong KG, entity/relation phải dùng đúng hướng cạnh, và không chấp nhận kết quả hard-code trực tiếp hoặc thông qua biến trung gian.</w:t>
+      </w:r>
+    </w:p>
+    <w:p>
+      <w:pPr>
+        <w:pStyle w:val="FirstParagraph"/>
+      </w:pPr>
+      <w:r>
+        <w:t xml:space="preserve">Nếu code sai, lỗi được đưa lại vào prompt cùng code cũ để LLM viết lại. Cơ chế này xử lý các lỗi như</w:t>
+      </w:r>
+      <w:r>
+        <w:t xml:space="preserve"> </w:t>
+      </w:r>
+      <w:r>
+        <w:rPr>
+          <w:rStyle w:val="VerbatimChar"/>
+        </w:rPr>
+        <w:t xml:space="preserve">SyntaxError</w:t>
+      </w:r>
+      <w:r>
+        <w:t xml:space="preserve">, dùng keyword không tồn tại (</w:t>
+      </w:r>
+      <w:r>
+        <w:rPr>
+          <w:rStyle w:val="VerbatimChar"/>
+        </w:rPr>
+        <w:t xml:space="preserve">obj</w:t>
+      </w:r>
+      <w:r>
+        <w:t xml:space="preserve">,</w:t>
+      </w:r>
+      <w:r>
+        <w:t xml:space="preserve"> </w:t>
+      </w:r>
+      <w:r>
+        <w:rPr>
+          <w:rStyle w:val="VerbatimChar"/>
+        </w:rPr>
+        <w:t xml:space="preserve">subject</w:t>
+      </w:r>
+      <w:r>
+        <w:t xml:space="preserve">), relation không có trong KG, sai chiều truy vấn hoặc thiếu phép gán</w:t>
+      </w:r>
+      <w:r>
+        <w:t xml:space="preserve"> </w:t>
+      </w:r>
+      <w:r>
+        <w:rPr>
+          <w:rStyle w:val="VerbatimChar"/>
+        </w:rPr>
+        <w:t xml:space="preserve">result</w:t>
+      </w:r>
+      <w:r>
+        <w:t xml:space="preserve">. Sau số lần retry cấu hình, path không sinh được code hợp lệ sẽ bị loại khỏi vòng đánh giá.</w:t>
+      </w:r>
+    </w:p>
+    <w:p>
+      <w:pPr>
+        <w:pStyle w:val="Heading3"/>
+      </w:pPr>
+      <w:bookmarkStart w:id="32" w:name="Xe31fe54fa39313dd36ad1f115edabbda2379ea9"/>
+      <w:r>
+        <w:t xml:space="preserve">1.9.3. Chạy code trong sandbox và trace evidence</w:t>
+      </w:r>
+      <w:bookmarkEnd w:id="32"/>
+    </w:p>
+    <w:p>
+      <w:pPr>
+        <w:pStyle w:val="FirstParagraph"/>
+      </w:pPr>
+      <w:r>
+        <w:t xml:space="preserve">Code hợp lệ được</w:t>
+      </w:r>
+      <w:r>
+        <w:t xml:space="preserve"> </w:t>
+      </w:r>
+      <w:r>
+        <w:rPr>
+          <w:rStyle w:val="VerbatimChar"/>
+        </w:rPr>
+        <w:t xml:space="preserve">SandboxExecutor</w:t>
+      </w:r>
+      <w:r>
+        <w:t xml:space="preserve"> </w:t>
+      </w:r>
+      <w:r>
+        <w:t xml:space="preserve">chạy với biến</w:t>
+      </w:r>
+      <w:r>
+        <w:t xml:space="preserve"> </w:t>
+      </w:r>
+      <w:r>
+        <w:rPr>
+          <w:rStyle w:val="VerbatimChar"/>
+        </w:rPr>
+        <w:t xml:space="preserve">kg</w:t>
+      </w:r>
+      <w:r>
+        <w:t xml:space="preserve"> </w:t>
+      </w:r>
+      <w:r>
+        <w:t xml:space="preserve">là một</w:t>
+      </w:r>
+      <w:r>
+        <w:t xml:space="preserve"> </w:t>
+      </w:r>
+      <w:r>
+        <w:rPr>
+          <w:rStyle w:val="VerbatimChar"/>
+        </w:rPr>
+        <w:t xml:space="preserve">TracingKG</w:t>
+      </w:r>
+      <w:r>
+        <w:t xml:space="preserve">, không phải graph thô. Môi trường thực thi chỉ cung cấp một tập built-in an toàn; code không được import module, đọc/ghi file hay gọi mạng. Thời gian chạy cũng bị giới hạn; lỗi runtime và timeout được chuyển thành trạng thái path thất bại thay vì làm dừng toàn pipeline.</w:t>
+      </w:r>
+    </w:p>
+    <w:p>
+      <w:pPr>
+        <w:pStyle w:val="BodyText"/>
+      </w:pPr>
+      <w:r>
+        <w:t xml:space="preserve">Mỗi lần</w:t>
+      </w:r>
+      <w:r>
+        <w:t xml:space="preserve"> </w:t>
+      </w:r>
+      <w:r>
+        <w:rPr>
+          <w:rStyle w:val="VerbatimChar"/>
+        </w:rPr>
+        <w:t xml:space="preserve">get_neighbors</w:t>
+      </w:r>
+      <w:r>
+        <w:t xml:space="preserve"> </w:t>
+      </w:r>
+      <w:r>
+        <w:t xml:space="preserve">hoặc</w:t>
+      </w:r>
+      <w:r>
+        <w:t xml:space="preserve"> </w:t>
+      </w:r>
+      <w:r>
+        <w:rPr>
+          <w:rStyle w:val="VerbatimChar"/>
+        </w:rPr>
+        <w:t xml:space="preserve">get_sources</w:t>
+      </w:r>
+      <w:r>
+        <w:t xml:space="preserve"> </w:t>
+      </w:r>
+      <w:r>
+        <w:t xml:space="preserve">trả về kết quả,</w:t>
+      </w:r>
+      <w:r>
+        <w:t xml:space="preserve"> </w:t>
+      </w:r>
+      <w:r>
+        <w:rPr>
+          <w:rStyle w:val="VerbatimChar"/>
+        </w:rPr>
+        <w:t xml:space="preserve">TracingKG</w:t>
+      </w:r>
+      <w:r>
+        <w:t xml:space="preserve"> </w:t>
+      </w:r>
+      <w:r>
+        <w:t xml:space="preserve">ghi lại evidence/provenance của các edge được truy cập. Kết quả thực thi được đóng gói trong</w:t>
+      </w:r>
+      <w:r>
+        <w:t xml:space="preserve"> </w:t>
+      </w:r>
+      <w:r>
+        <w:rPr>
+          <w:rStyle w:val="VerbatimChar"/>
+        </w:rPr>
+        <w:t xml:space="preserve">ExecResult</w:t>
+      </w:r>
+      <w:r>
+        <w:t xml:space="preserve">, gồm:</w:t>
+      </w:r>
+    </w:p>
+    <w:tbl>
+      <w:tblPr>
+        <w:tblStyle w:val="Table"/>
+        <w:tblW w:type="pct" w:w="0.0"/>
+        <w:tblLook w:firstRow="1"/>
+      </w:tblPr>
+      <w:tblGrid/>
+      <w:tr>
+        <w:trPr>
+          <w:cnfStyle w:firstRow="1"/>
+        </w:trPr>
+        <w:tc>
+          <w:tcPr>
+            <w:tcBorders>
+              <w:bottom w:val="single"/>
+            </w:tcBorders>
+            <w:vAlign w:val="bottom"/>
+          </w:tcPr>
+          <w:p>
+            <w:pPr>
+              <w:pStyle w:val="Compact"/>
+              <w:jc w:val="left"/>
+            </w:pPr>
+            <w:r>
+              <w:t xml:space="preserve">Trường</w:t>
+            </w:r>
+          </w:p>
+        </w:tc>
+        <w:tc>
+          <w:tcPr>
+            <w:tcBorders>
+              <w:bottom w:val="single"/>
+            </w:tcBorders>
+            <w:vAlign w:val="bottom"/>
+          </w:tcPr>
+          <w:p>
+            <w:pPr>
+              <w:pStyle w:val="Compact"/>
+              <w:jc w:val="left"/>
+            </w:pPr>
+            <w:r>
+              <w:t xml:space="preserve">Ý nghĩa</w:t>
+            </w:r>
+          </w:p>
+        </w:tc>
+      </w:tr>
+      <w:tr>
+        <w:tc>
+          <w:p>
+            <w:pPr>
+              <w:pStyle w:val="Compact"/>
+              <w:jc w:val="left"/>
+            </w:pPr>
+            <w:r>
+              <w:rPr>
+                <w:rStyle w:val="VerbatimChar"/>
+              </w:rPr>
+              <w:t xml:space="preserve">success</w:t>
+            </w:r>
+          </w:p>
+        </w:tc>
+        <w:tc>
+          <w:p>
+            <w:pPr>
+              <w:pStyle w:val="Compact"/>
+              <w:jc w:val="left"/>
+            </w:pPr>
+            <w:r>
+              <w:t xml:space="preserve">Code có chạy đến cuối hay không</w:t>
+            </w:r>
+          </w:p>
+        </w:tc>
+      </w:tr>
+      <w:tr>
+        <w:tc>
+          <w:p>
+            <w:pPr>
+              <w:pStyle w:val="Compact"/>
+              <w:jc w:val="left"/>
+            </w:pPr>
+            <w:r>
+              <w:rPr>
+                <w:rStyle w:val="VerbatimChar"/>
+              </w:rPr>
+              <w:t xml:space="preserve">value</w:t>
+            </w:r>
+          </w:p>
+        </w:tc>
+        <w:tc>
+          <w:p>
+            <w:pPr>
+              <w:pStyle w:val="Compact"/>
+              <w:jc w:val="left"/>
+            </w:pPr>
+            <w:r>
+              <w:t xml:space="preserve">Giá trị của biến</w:t>
+            </w:r>
+            <w:r>
+              <w:t xml:space="preserve"> </w:t>
+            </w:r>
+            <w:r>
+              <w:rPr>
+                <w:rStyle w:val="VerbatimChar"/>
+              </w:rPr>
+              <w:t xml:space="preserve">result</w:t>
+            </w:r>
+          </w:p>
+        </w:tc>
+      </w:tr>
+      <w:tr>
+        <w:tc>
+          <w:p>
+            <w:pPr>
+              <w:pStyle w:val="Compact"/>
+              <w:jc w:val="left"/>
+            </w:pPr>
+            <w:r>
+              <w:rPr>
+                <w:rStyle w:val="VerbatimChar"/>
+              </w:rPr>
+              <w:t xml:space="preserve">is_empty</w:t>
+            </w:r>
+          </w:p>
+        </w:tc>
+        <w:tc>
+          <w:p>
+            <w:pPr>
+              <w:pStyle w:val="Compact"/>
+              <w:jc w:val="left"/>
+            </w:pPr>
+            <w:r>
+              <w:t xml:space="preserve">Kết quả rỗng hoặc không có kết quả</w:t>
+            </w:r>
+          </w:p>
+        </w:tc>
+      </w:tr>
+      <w:tr>
+        <w:tc>
+          <w:p>
+            <w:pPr>
+              <w:pStyle w:val="Compact"/>
+              <w:jc w:val="left"/>
+            </w:pPr>
+            <w:r>
+              <w:rPr>
+                <w:rStyle w:val="VerbatimChar"/>
+              </w:rPr>
+              <w:t xml:space="preserve">error</w:t>
+            </w:r>
+          </w:p>
+        </w:tc>
+        <w:tc>
+          <w:p>
+            <w:pPr>
+              <w:pStyle w:val="Compact"/>
+              <w:jc w:val="left"/>
+            </w:pPr>
+            <w:r>
+              <w:t xml:space="preserve">Lỗi cú pháp/runtime/timeout nếu có</w:t>
+            </w:r>
+          </w:p>
+        </w:tc>
+      </w:tr>
+      <w:tr>
+        <w:tc>
+          <w:p>
+            <w:pPr>
+              <w:pStyle w:val="Compact"/>
+              <w:jc w:val="left"/>
+            </w:pPr>
+            <w:r>
+              <w:rPr>
+                <w:rStyle w:val="VerbatimChar"/>
+              </w:rPr>
+              <w:t xml:space="preserve">evidence</w:t>
+            </w:r>
+          </w:p>
+        </w:tc>
+        <w:tc>
+          <w:p>
+            <w:pPr>
+              <w:pStyle w:val="Compact"/>
+              <w:jc w:val="left"/>
+            </w:pPr>
+            <w:r>
+              <w:t xml:space="preserve">Các</w:t>
+            </w:r>
+            <w:r>
+              <w:t xml:space="preserve"> </w:t>
+            </w:r>
+            <w:r>
+              <w:rPr>
+                <w:rStyle w:val="VerbatimChar"/>
+              </w:rPr>
+              <w:t xml:space="preserve">EvidenceRef</w:t>
+            </w:r>
+            <w:r>
+              <w:t xml:space="preserve"> </w:t>
+            </w:r>
+            <w:r>
+              <w:t xml:space="preserve">của edge đã được truy cập</w:t>
+            </w:r>
+          </w:p>
+        </w:tc>
+      </w:tr>
+      <w:tr>
+        <w:tc>
+          <w:p>
+            <w:pPr>
+              <w:pStyle w:val="Compact"/>
+              <w:jc w:val="left"/>
+            </w:pPr>
+            <w:r>
+              <w:rPr>
+                <w:rStyle w:val="VerbatimChar"/>
+              </w:rPr>
+              <w:t xml:space="preserve">accessed_edges</w:t>
+            </w:r>
+          </w:p>
+        </w:tc>
+        <w:tc>
+          <w:p>
+            <w:pPr>
+              <w:pStyle w:val="Compact"/>
+              <w:jc w:val="left"/>
+            </w:pPr>
+            <w:r>
+              <w:t xml:space="preserve">Số lượng evidence/edge được trace</w:t>
+            </w:r>
+          </w:p>
+        </w:tc>
+      </w:tr>
+    </w:tbl>
+    <w:p>
+      <w:pPr>
+        <w:pStyle w:val="BodyText"/>
+      </w:pPr>
+      <w:r>
+        <w:t xml:space="preserve">Vì vậy, một path chỉ được xem là đã thực sự chứng minh answer khi code chạy thành công, trả kết quả không rỗng và để lại lineage evidence trong KG. Đây là khác biệt giữa việc LLM đề xuất một path có vẻ hợp lý và việc path đó được kiểm chứng bằng truy vấn thực thi.</w:t>
+      </w:r>
+    </w:p>
+    <w:p>
+      <w:pPr>
+        <w:pStyle w:val="Heading3"/>
+      </w:pPr>
+      <w:bookmarkStart w:id="33" w:name="từ-kết-quả-chạy-code-đến-điểm-path"/>
+      <w:r>
+        <w:t xml:space="preserve">1.9.4. Từ kết quả chạy code đến điểm path</w:t>
+      </w:r>
+      <w:bookmarkEnd w:id="33"/>
+    </w:p>
+    <w:p>
+      <w:pPr>
+        <w:pStyle w:val="FirstParagraph"/>
+      </w:pPr>
+      <w:r>
+        <w:t xml:space="preserve">Pipeline lưu bộ ba</w:t>
+      </w:r>
+      <w:r>
+        <w:t xml:space="preserve"> </w:t>
+      </w:r>
+      <w:r>
+        <w:rPr>
+          <w:rStyle w:val="VerbatimChar"/>
+        </w:rPr>
+        <w:t xml:space="preserve">(reasoning_path, generated_code, ExecResult)</w:t>
+      </w:r>
+      <w:r>
+        <w:t xml:space="preserve"> </w:t>
+      </w:r>
+      <w:r>
+        <w:t xml:space="preserve">cho từng candidate rồi đưa toàn bộ vào</w:t>
+      </w:r>
+      <w:r>
+        <w:t xml:space="preserve"> </w:t>
+      </w:r>
+      <w:r>
+        <w:rPr>
+          <w:rStyle w:val="VerbatimChar"/>
+        </w:rPr>
+        <w:t xml:space="preserve">PathEvaluator</w:t>
+      </w:r>
+      <w:r>
+        <w:t xml:space="preserve">. Evaluator loại ngay các path lỗi, path trả rỗng và path không có evidence. Với path còn lại, điểm được tính từ:</w:t>
       </w:r>
     </w:p>
     <w:p>
       <w:pPr>
         <w:pStyle w:val="Compact"/>
         <w:numPr>
-          <w:numId w:val="1002"/>
+          <w:numId w:val="1003"/>
           <w:ilvl w:val="0"/>
         </w:numPr>
       </w:pPr>
       <w:r>
-        <w:t xml:space="preserve">có nhiều triple và nhiều nguồn độc lập hỗ trợ;</w:t>
+        <w:t xml:space="preserve">số nguồn độc lập và số triple khác nhau đã được truy cập;</w:t>
       </w:r>
     </w:p>
     <w:p>
       <w:pPr>
         <w:pStyle w:val="Compact"/>
         <w:numPr>
-          <w:numId w:val="1002"/>
+          <w:numId w:val="1003"/>
           <w:ilvl w:val="0"/>
         </w:numPr>
       </w:pPr>
       <w:r>
-        <w:t xml:space="preserve">có evidence từ cả table và text;</w:t>
+        <w:t xml:space="preserve">provenance của table, text và web;</w:t>
       </w:r>
     </w:p>
     <w:p>
       <w:pPr>
         <w:pStyle w:val="Compact"/>
         <w:numPr>
-          <w:numId w:val="1002"/>
+          <w:numId w:val="1003"/>
           <w:ilvl w:val="0"/>
         </w:numPr>
       </w:pPr>
       <w:r>
-        <w:t xml:space="preserve">có nhiều path hợp lệ cùng trả answer đó;</w:t>
+        <w:t xml:space="preserve">bonus khi cùng một answer có hỗ trợ từ cả table và text;</w:t>
       </w:r>
     </w:p>
     <w:p>
       <w:pPr>
         <w:pStyle w:val="Compact"/>
         <w:numPr>
-          <w:numId w:val="1002"/>
+          <w:numId w:val="1003"/>
           <w:ilvl w:val="0"/>
         </w:numPr>
       </w:pPr>
       <w:r>
+        <w:t xml:space="preserve">mức đồng thuận của các path khác cùng trả answer;</w:t>
+      </w:r>
+    </w:p>
+    <w:p>
+      <w:pPr>
+        <w:pStyle w:val="Compact"/>
+        <w:numPr>
+          <w:numId w:val="1003"/>
+          <w:ilvl w:val="0"/>
+        </w:numPr>
+      </w:pPr>
+      <w:r>
+        <w:t xml:space="preserve">tỷ lệ evidence trực tiếp hỗ trợ output;</w:t>
+      </w:r>
+    </w:p>
+    <w:p>
+      <w:pPr>
+        <w:pStyle w:val="Compact"/>
+        <w:numPr>
+          <w:numId w:val="1003"/>
+          <w:ilvl w:val="0"/>
+        </w:numPr>
+      </w:pPr>
+      <w:r>
+        <w:t xml:space="preserve">penalty theo độ dài path.</w:t>
+      </w:r>
+    </w:p>
+    <w:p>
+      <w:pPr>
+        <w:pStyle w:val="FirstParagraph"/>
+      </w:pPr>
+      <w:r>
+        <w:t xml:space="preserve">Evaluator cũng phân biệt output được edge hỗ trợ trực tiếp với output số được suy ra từ các edge đã trace. Do đó một path nhiều người đồng thuận nhưng không truy cập được bằng chứng sẽ bị loại, còn path có code ngắn, chạy thành công và có provenance phù hợp sẽ được ưu tiên. Candidate có score cao nhất được chuyển sang</w:t>
+      </w:r>
+      <w:r>
+        <w:t xml:space="preserve"> </w:t>
+      </w:r>
+      <w:r>
+        <w:rPr>
+          <w:rStyle w:val="VerbatimChar"/>
+        </w:rPr>
+        <w:t xml:space="preserve">AnswerSynthesizer</w:t>
+      </w:r>
+      <w:r>
+        <w:t xml:space="preserve">, cùng với generated code, kết quả thực thi và evidence đã xác minh.</w:t>
+      </w:r>
+    </w:p>
+    <w:p>
+      <w:pPr>
+        <w:pStyle w:val="Heading2"/>
+      </w:pPr>
+      <w:bookmarkStart w:id="34" w:name="bước-8-thực-thi-path-trên-kg"/>
+      <w:r>
+        <w:t xml:space="preserve">1.10. Bước 8 — Thực thi path trên KG</w:t>
+      </w:r>
+      <w:bookmarkEnd w:id="34"/>
+    </w:p>
+    <w:p>
+      <w:pPr>
+        <w:pStyle w:val="FirstParagraph"/>
+      </w:pPr>
+      <w:r>
+        <w:t xml:space="preserve">Mỗi path được chuyển thành một chương trình truy vấn nhỏ. Chương trình chỉ được đọc KG qua các thao tác an toàn như đi từ entity tới giá trị, đi ngược từ giá trị tới entity nguồn, lọc/sắp xếp kết quả và lấy provenance.</w:t>
+      </w:r>
+    </w:p>
+    <w:p>
+      <w:pPr>
+        <w:pStyle w:val="BodyText"/>
+      </w:pPr>
+      <w:r>
+        <w:t xml:space="preserve">Chương trình chạy trong sandbox, không được truy cập file hoặc mạng. Nếu chương trình lỗi, trả rỗng hoặc không truy cập evidence trong KG, path không được xem là lời giải hợp lệ.</w:t>
+      </w:r>
+    </w:p>
+    <w:p>
+      <w:pPr>
+        <w:pStyle w:val="BodyText"/>
+      </w:pPr>
+      <w:r>
+        <w:t xml:space="preserve">Trong khi thực thi, hệ thống ghi lại các edge thực sự được sử dụng. Nhờ đó, answer của mỗi path có thể được đối chiếu với evidence cụ thể.</w:t>
+      </w:r>
+    </w:p>
+    <w:p>
+      <w:pPr>
+        <w:pStyle w:val="Heading2"/>
+      </w:pPr>
+      <w:bookmarkStart w:id="35" w:name="bước-9-chấm-điểm-grounded-consistency"/>
+      <w:r>
+        <w:t xml:space="preserve">1.11. Bước 9 — Chấm điểm grounded consistency</w:t>
+      </w:r>
+      <w:bookmarkEnd w:id="35"/>
+    </w:p>
+    <w:p>
+      <w:pPr>
+        <w:pStyle w:val="FirstParagraph"/>
+      </w:pPr>
+      <w:r>
+        <w:t xml:space="preserve">Phiên bản hiện tại không chỉ đếm số path trả cùng answer. Một path được ưu tiên khi:</w:t>
+      </w:r>
+    </w:p>
+    <w:p>
+      <w:pPr>
+        <w:pStyle w:val="Compact"/>
+        <w:numPr>
+          <w:numId w:val="1004"/>
+          <w:ilvl w:val="0"/>
+        </w:numPr>
+      </w:pPr>
+      <w:r>
+        <w:t xml:space="preserve">thực thi thành công và kết quả không rỗng;</w:t>
+      </w:r>
+    </w:p>
+    <w:p>
+      <w:pPr>
+        <w:pStyle w:val="Compact"/>
+        <w:numPr>
+          <w:numId w:val="1004"/>
+          <w:ilvl w:val="0"/>
+        </w:numPr>
+      </w:pPr>
+      <w:r>
+        <w:t xml:space="preserve">answer được nối trực tiếp hoặc suy ra từ các edge đã truy cập;</w:t>
+      </w:r>
+    </w:p>
+    <w:p>
+      <w:pPr>
+        <w:pStyle w:val="Compact"/>
+        <w:numPr>
+          <w:numId w:val="1004"/>
+          <w:ilvl w:val="0"/>
+        </w:numPr>
+      </w:pPr>
+      <w:r>
+        <w:t xml:space="preserve">có nhiều triple và nhiều nguồn độc lập hỗ trợ;</w:t>
+      </w:r>
+    </w:p>
+    <w:p>
+      <w:pPr>
+        <w:pStyle w:val="Compact"/>
+        <w:numPr>
+          <w:numId w:val="1004"/>
+          <w:ilvl w:val="0"/>
+        </w:numPr>
+      </w:pPr>
+      <w:r>
+        <w:t xml:space="preserve">có evidence từ cả table và text;</w:t>
+      </w:r>
+    </w:p>
+    <w:p>
+      <w:pPr>
+        <w:pStyle w:val="Compact"/>
+        <w:numPr>
+          <w:numId w:val="1004"/>
+          <w:ilvl w:val="0"/>
+        </w:numPr>
+      </w:pPr>
+      <w:r>
+        <w:t xml:space="preserve">có nhiều path hợp lệ cùng trả answer đó;</w:t>
+      </w:r>
+    </w:p>
+    <w:p>
+      <w:pPr>
+        <w:pStyle w:val="Compact"/>
+        <w:numPr>
+          <w:numId w:val="1004"/>
+          <w:ilvl w:val="0"/>
+        </w:numPr>
+      </w:pPr>
+      <w:r>
         <w:t xml:space="preserve">path đủ ngắn và không dùng quá nhiều evidence không liên quan.</w:t>
       </w:r>
     </w:p>
@@ -972,11 +1934,11 @@
       <w:pPr>
         <w:pStyle w:val="Heading2"/>
       </w:pPr>
-      <w:bookmarkStart w:id="31" w:name="bước-9-replanning"/>
-      <w:r>
-        <w:t xml:space="preserve">1.11. Bước 9 — Replanning</w:t>
-      </w:r>
-      <w:bookmarkEnd w:id="31"/>
+      <w:bookmarkStart w:id="36" w:name="bước-10-replanning"/>
+      <w:r>
+        <w:t xml:space="preserve">1.12. Bước 10 — Replanning</w:t>
+      </w:r>
+      <w:bookmarkEnd w:id="36"/>
     </w:p>
     <w:p>
       <w:pPr>
@@ -990,11 +1952,11 @@
       <w:pPr>
         <w:pStyle w:val="Heading2"/>
       </w:pPr>
-      <w:bookmarkStart w:id="32" w:name="bước-10-sinh-câu-trả-lời-cuối"/>
-      <w:r>
-        <w:t xml:space="preserve">1.12. Bước 10 — Sinh câu trả lời cuối</w:t>
-      </w:r>
-      <w:bookmarkEnd w:id="32"/>
+      <w:bookmarkStart w:id="37" w:name="bước-11-sinh-câu-trả-lời-cuối"/>
+      <w:r>
+        <w:t xml:space="preserve">1.13. Bước 11 — Sinh câu trả lời cuối</w:t>
+      </w:r>
+      <w:bookmarkEnd w:id="37"/>
     </w:p>
     <w:p>
       <w:pPr>
@@ -1008,31 +1970,31 @@
       <w:pPr>
         <w:pStyle w:val="Heading1"/>
       </w:pPr>
-      <w:bookmarkStart w:id="33" w:name="Xb7e32da04370eb216599bdf9360044b4b4416fe"/>
+      <w:bookmarkStart w:id="38" w:name="Xb7e32da04370eb216599bdf9360044b4b4416fe"/>
       <w:r>
         <w:t xml:space="preserve">2. Các ví dụ điển hình đã sử dụng trong thử nghiệm</w:t>
       </w:r>
-      <w:bookmarkEnd w:id="33"/>
+      <w:bookmarkEnd w:id="38"/>
     </w:p>
     <w:p>
       <w:pPr>
         <w:pStyle w:val="Heading2"/>
       </w:pPr>
-      <w:bookmarkStart w:id="34" w:name="Xc7c7c9d048bb0a6e78300319865f46c10c0a258"/>
+      <w:bookmarkStart w:id="39" w:name="Xc7c7c9d048bb0a6e78300319865f46c10c0a258"/>
       <w:r>
         <w:t xml:space="preserve">2.1. Ví dụ 1 — Từ ngày sinh tìm quốc tịch của manager</w:t>
       </w:r>
-      <w:bookmarkEnd w:id="34"/>
+      <w:bookmarkEnd w:id="39"/>
     </w:p>
     <w:p>
       <w:pPr>
         <w:pStyle w:val="Heading3"/>
       </w:pPr>
-      <w:bookmarkStart w:id="35" w:name="prompt-và-gold-answer"/>
+      <w:bookmarkStart w:id="40" w:name="prompt-và-gold-answer"/>
       <w:r>
         <w:t xml:space="preserve">Prompt và gold answer</w:t>
       </w:r>
-      <w:bookmarkEnd w:id="35"/>
+      <w:bookmarkEnd w:id="40"/>
     </w:p>
     <w:tbl>
       <w:tblPr>
@@ -1198,11 +2160,11 @@
       <w:pPr>
         <w:pStyle w:val="Heading3"/>
       </w:pPr>
-      <w:bookmarkStart w:id="36" w:name="dữ-liệu-chính"/>
+      <w:bookmarkStart w:id="41" w:name="dữ-liệu-chính"/>
       <w:r>
         <w:t xml:space="preserve">Dữ liệu chính</w:t>
       </w:r>
-      <w:bookmarkEnd w:id="36"/>
+      <w:bookmarkEnd w:id="41"/>
     </w:p>
     <w:p>
       <w:pPr>
@@ -1371,17 +2333,17 @@
       <w:pPr>
         <w:pStyle w:val="Heading3"/>
       </w:pPr>
-      <w:bookmarkStart w:id="37" w:name="các-bước-đã-chạy"/>
+      <w:bookmarkStart w:id="42" w:name="các-bước-đã-chạy"/>
       <w:r>
         <w:t xml:space="preserve">Các bước đã chạy</w:t>
       </w:r>
-      <w:bookmarkEnd w:id="37"/>
+      <w:bookmarkEnd w:id="42"/>
     </w:p>
     <w:p>
       <w:pPr>
         <w:pStyle w:val="Compact"/>
         <w:numPr>
-          <w:numId w:val="1003"/>
+          <w:numId w:val="1005"/>
           <w:ilvl w:val="0"/>
         </w:numPr>
       </w:pPr>
@@ -1402,7 +2364,7 @@
       <w:pPr>
         <w:pStyle w:val="Compact"/>
         <w:numPr>
-          <w:numId w:val="1003"/>
+          <w:numId w:val="1005"/>
           <w:ilvl w:val="0"/>
         </w:numPr>
       </w:pPr>
@@ -1423,7 +2385,7 @@
       <w:pPr>
         <w:pStyle w:val="Compact"/>
         <w:numPr>
-          <w:numId w:val="1003"/>
+          <w:numId w:val="1005"/>
           <w:ilvl w:val="0"/>
         </w:numPr>
       </w:pPr>
@@ -1492,7 +2454,7 @@
       <w:pPr>
         <w:pStyle w:val="Compact"/>
         <w:numPr>
-          <w:numId w:val="1003"/>
+          <w:numId w:val="1005"/>
           <w:ilvl w:val="0"/>
         </w:numPr>
       </w:pPr>
@@ -1513,7 +2475,7 @@
       <w:pPr>
         <w:pStyle w:val="Compact"/>
         <w:numPr>
-          <w:numId w:val="1003"/>
+          <w:numId w:val="1005"/>
           <w:ilvl w:val="0"/>
         </w:numPr>
       </w:pPr>
@@ -1534,7 +2496,7 @@
       <w:pPr>
         <w:pStyle w:val="Compact"/>
         <w:numPr>
-          <w:numId w:val="1003"/>
+          <w:numId w:val="1005"/>
           <w:ilvl w:val="0"/>
         </w:numPr>
       </w:pPr>
@@ -1585,7 +2547,7 @@
       <w:pPr>
         <w:pStyle w:val="Compact"/>
         <w:numPr>
-          <w:numId w:val="1003"/>
+          <w:numId w:val="1005"/>
           <w:ilvl w:val="0"/>
         </w:numPr>
       </w:pPr>
@@ -1606,7 +2568,7 @@
       <w:pPr>
         <w:pStyle w:val="Compact"/>
         <w:numPr>
-          <w:numId w:val="1003"/>
+          <w:numId w:val="1005"/>
           <w:ilvl w:val="0"/>
         </w:numPr>
       </w:pPr>
@@ -1639,11 +2601,11 @@
       <w:pPr>
         <w:pStyle w:val="Heading3"/>
       </w:pPr>
-      <w:bookmarkStart w:id="38" w:name="online-kg-đã-tạo"/>
+      <w:bookmarkStart w:id="43" w:name="online-kg-đã-tạo"/>
       <w:r>
         <w:t xml:space="preserve">Online KG đã tạo</w:t>
       </w:r>
-      <w:bookmarkEnd w:id="38"/>
+      <w:bookmarkEnd w:id="43"/>
     </w:p>
     <w:p>
       <w:pPr>
@@ -2242,21 +3204,21 @@
       <w:pPr>
         <w:pStyle w:val="Heading2"/>
       </w:pPr>
-      <w:bookmarkStart w:id="39" w:name="X06210bd0b74f8d5a3149ea9d2e75594f33b4f2f"/>
+      <w:bookmarkStart w:id="44" w:name="X06210bd0b74f8d5a3149ea9d2e75594f33b4f2f"/>
       <w:r>
         <w:t xml:space="preserve">2.2. Ví dụ 2 — Ranking trong bảng rồi tìm tên đệm trong passage</w:t>
       </w:r>
-      <w:bookmarkEnd w:id="39"/>
+      <w:bookmarkEnd w:id="44"/>
     </w:p>
     <w:p>
       <w:pPr>
         <w:pStyle w:val="Heading3"/>
       </w:pPr>
-      <w:bookmarkStart w:id="40" w:name="prompt-và-gold-answer-1"/>
+      <w:bookmarkStart w:id="45" w:name="prompt-và-gold-answer-1"/>
       <w:r>
         <w:t xml:space="preserve">Prompt và gold answer</w:t>
       </w:r>
-      <w:bookmarkEnd w:id="40"/>
+      <w:bookmarkEnd w:id="45"/>
     </w:p>
     <w:tbl>
       <w:tblPr>
@@ -2469,11 +3431,11 @@
       <w:pPr>
         <w:pStyle w:val="Heading3"/>
       </w:pPr>
-      <w:bookmarkStart w:id="41" w:name="dữ-liệu-chính-1"/>
+      <w:bookmarkStart w:id="46" w:name="dữ-liệu-chính-1"/>
       <w:r>
         <w:t xml:space="preserve">Dữ liệu chính</w:t>
       </w:r>
-      <w:bookmarkEnd w:id="41"/>
+      <w:bookmarkEnd w:id="46"/>
     </w:p>
     <w:tbl>
       <w:tblPr>
@@ -2667,11 +3629,11 @@
       <w:pPr>
         <w:pStyle w:val="Heading3"/>
       </w:pPr>
-      <w:bookmarkStart w:id="42" w:name="online-kg-mục-tiêu"/>
+      <w:bookmarkStart w:id="47" w:name="online-kg-mục-tiêu"/>
       <w:r>
         <w:t xml:space="preserve">Online KG mục tiêu</w:t>
       </w:r>
-      <w:bookmarkEnd w:id="42"/>
+      <w:bookmarkEnd w:id="47"/>
     </w:p>
     <w:p>
       <w:pPr>
@@ -2998,17 +3960,17 @@
       <w:pPr>
         <w:pStyle w:val="Heading3"/>
       </w:pPr>
-      <w:bookmarkStart w:id="43" w:name="các-bước-reasoning-cần-thực-hiện"/>
+      <w:bookmarkStart w:id="48" w:name="các-bước-reasoning-cần-thực-hiện"/>
       <w:r>
         <w:t xml:space="preserve">Các bước reasoning cần thực hiện</w:t>
       </w:r>
-      <w:bookmarkEnd w:id="43"/>
+      <w:bookmarkEnd w:id="48"/>
     </w:p>
     <w:p>
       <w:pPr>
         <w:pStyle w:val="Compact"/>
         <w:numPr>
-          <w:numId w:val="1004"/>
+          <w:numId w:val="1006"/>
           <w:ilvl w:val="0"/>
         </w:numPr>
       </w:pPr>
@@ -3020,7 +3982,7 @@
       <w:pPr>
         <w:pStyle w:val="Compact"/>
         <w:numPr>
-          <w:numId w:val="1004"/>
+          <w:numId w:val="1006"/>
           <w:ilvl w:val="0"/>
         </w:numPr>
       </w:pPr>
@@ -3032,7 +3994,7 @@
       <w:pPr>
         <w:pStyle w:val="Compact"/>
         <w:numPr>
-          <w:numId w:val="1004"/>
+          <w:numId w:val="1006"/>
           <w:ilvl w:val="0"/>
         </w:numPr>
       </w:pPr>
@@ -3059,7 +4021,7 @@
       <w:pPr>
         <w:pStyle w:val="Compact"/>
         <w:numPr>
-          <w:numId w:val="1004"/>
+          <w:numId w:val="1006"/>
           <w:ilvl w:val="0"/>
         </w:numPr>
       </w:pPr>
@@ -3083,7 +4045,7 @@
       <w:pPr>
         <w:pStyle w:val="Compact"/>
         <w:numPr>
-          <w:numId w:val="1004"/>
+          <w:numId w:val="1006"/>
           <w:ilvl w:val="0"/>
         </w:numPr>
       </w:pPr>
@@ -3095,11 +4057,11 @@
       <w:pPr>
         <w:pStyle w:val="Heading3"/>
       </w:pPr>
-      <w:bookmarkStart w:id="44" w:name="kết-quả-thử-nghiệm-đã-ghi-nhận"/>
+      <w:bookmarkStart w:id="49" w:name="kết-quả-thử-nghiệm-đã-ghi-nhận"/>
       <w:r>
         <w:t xml:space="preserve">Kết quả thử nghiệm đã ghi nhận</w:t>
       </w:r>
-      <w:bookmarkEnd w:id="44"/>
+      <w:bookmarkEnd w:id="49"/>
     </w:p>
     <w:p>
       <w:pPr>
@@ -3133,21 +4095,21 @@
       <w:pPr>
         <w:pStyle w:val="Heading2"/>
       </w:pPr>
-      <w:bookmarkStart w:id="45" w:name="Xc7b8839691ab0089e0fb36ea246d4c58ab3fad2"/>
+      <w:bookmarkStart w:id="50" w:name="Xc7b8839691ab0089e0fb36ea246d4c58ab3fad2"/>
       <w:r>
         <w:t xml:space="preserve">2.3. Ví dụ 3 — Chuẩn hóa entity giữa nhiều nguồn</w:t>
       </w:r>
-      <w:bookmarkEnd w:id="45"/>
+      <w:bookmarkEnd w:id="50"/>
     </w:p>
     <w:p>
       <w:pPr>
         <w:pStyle w:val="Heading3"/>
       </w:pPr>
-      <w:bookmarkStart w:id="46" w:name="prompt-và-expected-answer"/>
+      <w:bookmarkStart w:id="51" w:name="prompt-và-expected-answer"/>
       <w:r>
         <w:t xml:space="preserve">Prompt và expected answer</w:t>
       </w:r>
-      <w:bookmarkEnd w:id="46"/>
+      <w:bookmarkEnd w:id="51"/>
     </w:p>
     <w:tbl>
       <w:tblPr>
@@ -3283,11 +4245,11 @@
       <w:pPr>
         <w:pStyle w:val="Heading3"/>
       </w:pPr>
-      <w:bookmarkStart w:id="47" w:name="kg-trước-chuẩn-hóa"/>
+      <w:bookmarkStart w:id="52" w:name="kg-trước-chuẩn-hóa"/>
       <w:r>
         <w:t xml:space="preserve">KG trước chuẩn hóa</w:t>
       </w:r>
-      <w:bookmarkEnd w:id="47"/>
+      <w:bookmarkEnd w:id="52"/>
     </w:p>
     <w:p>
       <w:pPr>
@@ -3313,17 +4275,17 @@
       <w:pPr>
         <w:pStyle w:val="Heading3"/>
       </w:pPr>
-      <w:bookmarkStart w:id="48" w:name="bước-đã-chạy"/>
+      <w:bookmarkStart w:id="53" w:name="bước-đã-chạy"/>
       <w:r>
         <w:t xml:space="preserve">Bước đã chạy</w:t>
       </w:r>
-      <w:bookmarkEnd w:id="48"/>
+      <w:bookmarkEnd w:id="53"/>
     </w:p>
     <w:p>
       <w:pPr>
         <w:pStyle w:val="Compact"/>
         <w:numPr>
-          <w:numId w:val="1005"/>
+          <w:numId w:val="1007"/>
           <w:ilvl w:val="0"/>
         </w:numPr>
       </w:pPr>
@@ -3335,7 +4297,7 @@
       <w:pPr>
         <w:pStyle w:val="Compact"/>
         <w:numPr>
-          <w:numId w:val="1005"/>
+          <w:numId w:val="1007"/>
           <w:ilvl w:val="0"/>
         </w:numPr>
       </w:pPr>
@@ -3362,7 +4324,7 @@
       <w:pPr>
         <w:pStyle w:val="Compact"/>
         <w:numPr>
-          <w:numId w:val="1005"/>
+          <w:numId w:val="1007"/>
           <w:ilvl w:val="0"/>
         </w:numPr>
       </w:pPr>
@@ -3374,7 +4336,7 @@
       <w:pPr>
         <w:pStyle w:val="Compact"/>
         <w:numPr>
-          <w:numId w:val="1005"/>
+          <w:numId w:val="1007"/>
           <w:ilvl w:val="0"/>
         </w:numPr>
       </w:pPr>
@@ -3386,7 +4348,7 @@
       <w:pPr>
         <w:pStyle w:val="Compact"/>
         <w:numPr>
-          <w:numId w:val="1005"/>
+          <w:numId w:val="1007"/>
           <w:ilvl w:val="0"/>
         </w:numPr>
       </w:pPr>
@@ -3425,11 +4387,11 @@
       <w:pPr>
         <w:pStyle w:val="Heading3"/>
       </w:pPr>
-      <w:bookmarkStart w:id="49" w:name="kg-sau-chuẩn-hóa"/>
+      <w:bookmarkStart w:id="54" w:name="kg-sau-chuẩn-hóa"/>
       <w:r>
         <w:t xml:space="preserve">KG sau chuẩn hóa</w:t>
       </w:r>
-      <w:bookmarkEnd w:id="49"/>
+      <w:bookmarkEnd w:id="54"/>
     </w:p>
     <w:p>
       <w:pPr>
@@ -3472,11 +4434,1475 @@
       <w:pPr>
         <w:pStyle w:val="Heading2"/>
       </w:pPr>
-      <w:bookmarkStart w:id="50" w:name="tổng-hợp"/>
-      <w:r>
-        <w:t xml:space="preserve">2.4. Tổng hợp</w:t>
-      </w:r>
-      <w:bookmarkEnd w:id="50"/>
+      <w:bookmarkStart w:id="55" w:name="X82664bd44e07b933964b2038cd6f79b379d653a"/>
+      <w:r>
+        <w:t xml:space="preserve">2.4. Ví dụ 4 — FinQA: tính payment volume trung bình trên mỗi transaction</w:t>
+      </w:r>
+      <w:bookmarkEnd w:id="55"/>
+    </w:p>
+    <w:p>
+      <w:pPr>
+        <w:pStyle w:val="Heading3"/>
+      </w:pPr>
+      <w:bookmarkStart w:id="56" w:name="prompt-và-gold-answer-2"/>
+      <w:r>
+        <w:t xml:space="preserve">Prompt và gold answer</w:t>
+      </w:r>
+      <w:bookmarkEnd w:id="56"/>
+    </w:p>
+    <w:tbl>
+      <w:tblPr>
+        <w:tblStyle w:val="Table"/>
+        <w:tblW w:type="pct" w:w="5000.0"/>
+        <w:tblLook w:firstRow="1"/>
+      </w:tblPr>
+      <w:tblGrid>
+        <w:gridCol w:w="3960"/>
+        <w:gridCol w:w="3960"/>
+      </w:tblGrid>
+      <w:tr>
+        <w:trPr>
+          <w:cnfStyle w:firstRow="1"/>
+        </w:trPr>
+        <w:tc>
+          <w:tcPr>
+            <w:tcBorders>
+              <w:bottom w:val="single"/>
+            </w:tcBorders>
+            <w:vAlign w:val="bottom"/>
+          </w:tcPr>
+          <w:p>
+            <w:pPr>
+              <w:pStyle w:val="Compact"/>
+              <w:jc w:val="left"/>
+            </w:pPr>
+            <w:r>
+              <w:t xml:space="preserve">Nội dung</w:t>
+            </w:r>
+          </w:p>
+        </w:tc>
+        <w:tc>
+          <w:tcPr>
+            <w:tcBorders>
+              <w:bottom w:val="single"/>
+            </w:tcBorders>
+            <w:vAlign w:val="bottom"/>
+          </w:tcPr>
+          <w:p>
+            <w:pPr>
+              <w:pStyle w:val="Compact"/>
+              <w:jc w:val="left"/>
+            </w:pPr>
+            <w:r>
+              <w:t xml:space="preserve">Giá trị</w:t>
+            </w:r>
+          </w:p>
+        </w:tc>
+      </w:tr>
+      <w:tr>
+        <w:tc>
+          <w:p>
+            <w:pPr>
+              <w:pStyle w:val="Compact"/>
+              <w:jc w:val="left"/>
+            </w:pPr>
+            <w:r>
+              <w:t xml:space="preserve">Example ID</w:t>
+            </w:r>
+          </w:p>
+        </w:tc>
+        <w:tc>
+          <w:p>
+            <w:pPr>
+              <w:pStyle w:val="Compact"/>
+              <w:jc w:val="left"/>
+            </w:pPr>
+            <w:r>
+              <w:rPr>
+                <w:rStyle w:val="VerbatimChar"/>
+              </w:rPr>
+              <w:t xml:space="preserve">V/2008/page_17.pdf-1</w:t>
+            </w:r>
+          </w:p>
+        </w:tc>
+      </w:tr>
+      <w:tr>
+        <w:tc>
+          <w:p>
+            <w:pPr>
+              <w:pStyle w:val="Compact"/>
+              <w:jc w:val="left"/>
+            </w:pPr>
+            <w:r>
+              <w:t xml:space="preserve">Prompt</w:t>
+            </w:r>
+          </w:p>
+        </w:tc>
+        <w:tc>
+          <w:p>
+            <w:pPr>
+              <w:pStyle w:val="Compact"/>
+              <w:jc w:val="left"/>
+            </w:pPr>
+            <w:r>
+              <w:t xml:space="preserve">What is the average payment volume per transaction for American Express?</w:t>
+            </w:r>
+          </w:p>
+        </w:tc>
+      </w:tr>
+      <w:tr>
+        <w:tc>
+          <w:p>
+            <w:pPr>
+              <w:pStyle w:val="Compact"/>
+              <w:jc w:val="left"/>
+            </w:pPr>
+            <w:r>
+              <w:t xml:space="preserve">Gold program</w:t>
+            </w:r>
+          </w:p>
+        </w:tc>
+        <w:tc>
+          <w:p>
+            <w:pPr>
+              <w:pStyle w:val="Compact"/>
+              <w:jc w:val="left"/>
+            </w:pPr>
+            <w:r>
+              <w:rPr>
+                <w:rStyle w:val="VerbatimChar"/>
+              </w:rPr>
+              <w:t xml:space="preserve">637 ÷ 5</w:t>
+            </w:r>
+          </w:p>
+        </w:tc>
+      </w:tr>
+      <w:tr>
+        <w:tc>
+          <w:p>
+            <w:pPr>
+              <w:pStyle w:val="Compact"/>
+              <w:jc w:val="left"/>
+            </w:pPr>
+            <w:r>
+              <w:t xml:space="preserve">Gold answer</w:t>
+            </w:r>
+          </w:p>
+        </w:tc>
+        <w:tc>
+          <w:p>
+            <w:pPr>
+              <w:pStyle w:val="Compact"/>
+              <w:jc w:val="left"/>
+            </w:pPr>
+            <w:r>
+              <w:rPr>
+                <w:rStyle w:val="VerbatimChar"/>
+              </w:rPr>
+              <w:t xml:space="preserve">127.4</w:t>
+            </w:r>
+          </w:p>
+        </w:tc>
+      </w:tr>
+      <w:tr>
+        <w:tc>
+          <w:p>
+            <w:pPr>
+              <w:pStyle w:val="Compact"/>
+              <w:jc w:val="left"/>
+            </w:pPr>
+            <w:r>
+              <w:t xml:space="preserve">Display answer</w:t>
+            </w:r>
+          </w:p>
+        </w:tc>
+        <w:tc>
+          <w:p>
+            <w:pPr>
+              <w:pStyle w:val="Compact"/>
+              <w:jc w:val="left"/>
+            </w:pPr>
+            <w:r>
+              <w:rPr>
+                <w:rStyle w:val="VerbatimChar"/>
+              </w:rPr>
+              <w:t xml:space="preserve">127.40</w:t>
+            </w:r>
+          </w:p>
+        </w:tc>
+      </w:tr>
+    </w:tbl>
+    <w:p>
+      <w:pPr>
+        <w:pStyle w:val="BodyText"/>
+      </w:pPr>
+      <w:r>
+        <w:t xml:space="preserve">Đây là câu hỏi số học trên báo cáo tài chính. Hệ thống phải chọn đúng dòng American Express, lấy đúng hai cột và thực hiện phép chia.</w:t>
+      </w:r>
+    </w:p>
+    <w:p>
+      <w:pPr>
+        <w:pStyle w:val="Heading3"/>
+      </w:pPr>
+      <w:bookmarkStart w:id="57" w:name="dữ-liệu-chính-2"/>
+      <w:r>
+        <w:t xml:space="preserve">Dữ liệu chính</w:t>
+      </w:r>
+      <w:bookmarkEnd w:id="57"/>
+    </w:p>
+    <w:tbl>
+      <w:tblPr>
+        <w:tblStyle w:val="Table"/>
+        <w:tblW w:type="pct" w:w="0.0"/>
+        <w:tblLook w:firstRow="1"/>
+      </w:tblPr>
+      <w:tblGrid/>
+      <w:tr>
+        <w:trPr>
+          <w:cnfStyle w:firstRow="1"/>
+        </w:trPr>
+        <w:tc>
+          <w:tcPr>
+            <w:tcBorders>
+              <w:bottom w:val="single"/>
+            </w:tcBorders>
+            <w:vAlign w:val="bottom"/>
+          </w:tcPr>
+          <w:p>
+            <w:pPr>
+              <w:pStyle w:val="Compact"/>
+              <w:jc w:val="left"/>
+            </w:pPr>
+            <w:r>
+              <w:t xml:space="preserve">Company</w:t>
+            </w:r>
+          </w:p>
+        </w:tc>
+        <w:tc>
+          <w:tcPr>
+            <w:tcBorders>
+              <w:bottom w:val="single"/>
+            </w:tcBorders>
+            <w:vAlign w:val="bottom"/>
+          </w:tcPr>
+          <w:p>
+            <w:pPr>
+              <w:pStyle w:val="Compact"/>
+              <w:jc w:val="right"/>
+            </w:pPr>
+            <w:r>
+              <w:t xml:space="preserve">Payments Volume (billions)</w:t>
+            </w:r>
+          </w:p>
+        </w:tc>
+        <w:tc>
+          <w:tcPr>
+            <w:tcBorders>
+              <w:bottom w:val="single"/>
+            </w:tcBorders>
+            <w:vAlign w:val="bottom"/>
+          </w:tcPr>
+          <w:p>
+            <w:pPr>
+              <w:pStyle w:val="Compact"/>
+              <w:jc w:val="right"/>
+            </w:pPr>
+            <w:r>
+              <w:t xml:space="preserve">Total Transactions (billions)</w:t>
+            </w:r>
+          </w:p>
+        </w:tc>
+      </w:tr>
+      <w:tr>
+        <w:tc>
+          <w:p>
+            <w:pPr>
+              <w:pStyle w:val="Compact"/>
+              <w:jc w:val="left"/>
+            </w:pPr>
+            <w:r>
+              <w:t xml:space="preserve">Visa</w:t>
+            </w:r>
+          </w:p>
+        </w:tc>
+        <w:tc>
+          <w:p>
+            <w:pPr>
+              <w:pStyle w:val="Compact"/>
+              <w:jc w:val="right"/>
+            </w:pPr>
+            <w:r>
+              <w:t xml:space="preserve">2,457</w:t>
+            </w:r>
+          </w:p>
+        </w:tc>
+        <w:tc>
+          <w:p>
+            <w:pPr>
+              <w:pStyle w:val="Compact"/>
+              <w:jc w:val="right"/>
+            </w:pPr>
+            <w:r>
+              <w:t xml:space="preserve">50.3</w:t>
+            </w:r>
+          </w:p>
+        </w:tc>
+      </w:tr>
+      <w:tr>
+        <w:tc>
+          <w:p>
+            <w:pPr>
+              <w:pStyle w:val="Compact"/>
+              <w:jc w:val="left"/>
+            </w:pPr>
+            <w:r>
+              <w:t xml:space="preserve">MasterCard</w:t>
+            </w:r>
+          </w:p>
+        </w:tc>
+        <w:tc>
+          <w:p>
+            <w:pPr>
+              <w:pStyle w:val="Compact"/>
+              <w:jc w:val="right"/>
+            </w:pPr>
+            <w:r>
+              <w:t xml:space="preserve">1,697</w:t>
+            </w:r>
+          </w:p>
+        </w:tc>
+        <w:tc>
+          <w:p>
+            <w:pPr>
+              <w:pStyle w:val="Compact"/>
+              <w:jc w:val="right"/>
+            </w:pPr>
+            <w:r>
+              <w:t xml:space="preserve">27.0</w:t>
+            </w:r>
+          </w:p>
+        </w:tc>
+      </w:tr>
+      <w:tr>
+        <w:tc>
+          <w:p>
+            <w:pPr>
+              <w:pStyle w:val="Compact"/>
+              <w:jc w:val="left"/>
+            </w:pPr>
+            <w:r>
+              <w:t xml:space="preserve">American Express</w:t>
+            </w:r>
+          </w:p>
+        </w:tc>
+        <w:tc>
+          <w:p>
+            <w:pPr>
+              <w:pStyle w:val="Compact"/>
+              <w:jc w:val="right"/>
+            </w:pPr>
+            <w:r>
+              <w:t xml:space="preserve">637</w:t>
+            </w:r>
+          </w:p>
+        </w:tc>
+        <w:tc>
+          <w:p>
+            <w:pPr>
+              <w:pStyle w:val="Compact"/>
+              <w:jc w:val="right"/>
+            </w:pPr>
+            <w:r>
+              <w:t xml:space="preserve">5.0</w:t>
+            </w:r>
+          </w:p>
+        </w:tc>
+      </w:tr>
+      <w:tr>
+        <w:tc>
+          <w:p>
+            <w:pPr>
+              <w:pStyle w:val="Compact"/>
+              <w:jc w:val="left"/>
+            </w:pPr>
+            <w:r>
+              <w:t xml:space="preserve">Discover</w:t>
+            </w:r>
+          </w:p>
+        </w:tc>
+        <w:tc>
+          <w:p>
+            <w:pPr>
+              <w:pStyle w:val="Compact"/>
+              <w:jc w:val="right"/>
+            </w:pPr>
+            <w:r>
+              <w:t xml:space="preserve">102</w:t>
+            </w:r>
+          </w:p>
+        </w:tc>
+        <w:tc>
+          <w:p>
+            <w:pPr>
+              <w:pStyle w:val="Compact"/>
+              <w:jc w:val="right"/>
+            </w:pPr>
+            <w:r>
+              <w:t xml:space="preserve">1.6</w:t>
+            </w:r>
+          </w:p>
+        </w:tc>
+      </w:tr>
+    </w:tbl>
+    <w:p>
+      <w:pPr>
+        <w:pStyle w:val="BodyText"/>
+      </w:pPr>
+      <w:r>
+        <w:t xml:space="preserve">Phép tính cần thực hiện:</w:t>
+      </w:r>
+    </w:p>
+    <w:p>
+      <w:pPr>
+        <w:pStyle w:val="SourceCode"/>
+      </w:pPr>
+      <w:r>
+        <w:rPr>
+          <w:rStyle w:val="VerbatimChar"/>
+        </w:rPr>
+        <w:t xml:space="preserve">Average payment volume per transaction</w:t>
+      </w:r>
+      <w:r>
+        <w:br w:type="textWrapping"/>
+      </w:r>
+      <w:r>
+        <w:rPr>
+          <w:rStyle w:val="VerbatimChar"/>
+        </w:rPr>
+        <w:t xml:space="preserve">= Payments Volume / Total Transactions</w:t>
+      </w:r>
+      <w:r>
+        <w:br w:type="textWrapping"/>
+      </w:r>
+      <w:r>
+        <w:rPr>
+          <w:rStyle w:val="VerbatimChar"/>
+        </w:rPr>
+        <w:t xml:space="preserve">= 637 / 5.0</w:t>
+      </w:r>
+      <w:r>
+        <w:br w:type="textWrapping"/>
+      </w:r>
+      <w:r>
+        <w:rPr>
+          <w:rStyle w:val="VerbatimChar"/>
+        </w:rPr>
+        <w:t xml:space="preserve">= 127.4</w:t>
+      </w:r>
+    </w:p>
+    <w:p>
+      <w:pPr>
+        <w:pStyle w:val="Heading3"/>
+      </w:pPr>
+      <w:bookmarkStart w:id="58" w:name="các-bước-pipeline-đã-chạy"/>
+      <w:r>
+        <w:t xml:space="preserve">Các bước pipeline đã chạy</w:t>
+      </w:r>
+      <w:bookmarkEnd w:id="58"/>
+    </w:p>
+    <w:p>
+      <w:pPr>
+        <w:pStyle w:val="Compact"/>
+        <w:numPr>
+          <w:numId w:val="1008"/>
+          <w:ilvl w:val="0"/>
+        </w:numPr>
+      </w:pPr>
+      <w:r>
+        <w:rPr>
+          <w:b/>
+        </w:rPr>
+        <w:t xml:space="preserve">Nhận context:</w:t>
+      </w:r>
+      <w:r>
+        <w:t xml:space="preserve"> </w:t>
+      </w:r>
+      <w:r>
+        <w:t xml:space="preserve">adapter FinQA chuyển bảng báo cáo và các câu văn xung quanh thành đầu vào chung của pipeline.</w:t>
+      </w:r>
+    </w:p>
+    <w:p>
+      <w:pPr>
+        <w:pStyle w:val="Compact"/>
+        <w:numPr>
+          <w:numId w:val="1008"/>
+          <w:ilvl w:val="0"/>
+        </w:numPr>
+      </w:pPr>
+      <w:r>
+        <w:rPr>
+          <w:b/>
+        </w:rPr>
+        <w:t xml:space="preserve">Retrieval:</w:t>
+      </w:r>
+      <w:r>
+        <w:t xml:space="preserve"> </w:t>
+      </w:r>
+      <w:r>
+        <w:t xml:space="preserve">bảng được giữ lại; các đoạn văn liên quan đến payment network và transaction được xếp hạng.</w:t>
+      </w:r>
+    </w:p>
+    <w:p>
+      <w:pPr>
+        <w:pStyle w:val="Compact"/>
+        <w:numPr>
+          <w:numId w:val="1008"/>
+          <w:ilvl w:val="0"/>
+        </w:numPr>
+      </w:pPr>
+      <w:r>
+        <w:rPr>
+          <w:b/>
+        </w:rPr>
+        <w:t xml:space="preserve">Extraction:</w:t>
+      </w:r>
+      <w:r>
+        <w:t xml:space="preserve"> </w:t>
+      </w:r>
+      <w:r>
+        <w:t xml:space="preserve">hệ thống tạo các fact cho từng công ty, trong đó có payment volume và total transactions của American Express.</w:t>
+      </w:r>
+    </w:p>
+    <w:p>
+      <w:pPr>
+        <w:pStyle w:val="Compact"/>
+        <w:numPr>
+          <w:numId w:val="1008"/>
+          <w:ilvl w:val="0"/>
+        </w:numPr>
+      </w:pPr>
+      <w:r>
+        <w:rPr>
+          <w:b/>
+        </w:rPr>
+        <w:t xml:space="preserve">Normalization:</w:t>
+      </w:r>
+      <w:r>
+        <w:t xml:space="preserve"> </w:t>
+      </w:r>
+      <w:r>
+        <w:t xml:space="preserve">tên entity trùng được hợp nhất; run ghi nhận hai lexical entity merges.</w:t>
+      </w:r>
+    </w:p>
+    <w:p>
+      <w:pPr>
+        <w:pStyle w:val="Compact"/>
+        <w:numPr>
+          <w:numId w:val="1008"/>
+          <w:ilvl w:val="0"/>
+        </w:numPr>
+      </w:pPr>
+      <w:r>
+        <w:rPr>
+          <w:b/>
+        </w:rPr>
+        <w:t xml:space="preserve">KG construction:</w:t>
+      </w:r>
+      <w:r>
+        <w:t xml:space="preserve"> </w:t>
+      </w:r>
+      <w:r>
+        <w:t xml:space="preserve">KG được tạo với 82 nodes, 71 edges và 38 loại relation; không có triple bị loại.</w:t>
+      </w:r>
+    </w:p>
+    <w:p>
+      <w:pPr>
+        <w:pStyle w:val="Compact"/>
+        <w:numPr>
+          <w:numId w:val="1008"/>
+          <w:ilvl w:val="0"/>
+        </w:numPr>
+      </w:pPr>
+      <w:r>
+        <w:rPr>
+          <w:b/>
+        </w:rPr>
+        <w:t xml:space="preserve">Planning:</w:t>
+      </w:r>
+      <w:r>
+        <w:t xml:space="preserve"> </w:t>
+      </w:r>
+      <w:r>
+        <w:t xml:space="preserve">ba candidate paths được yêu cầu. Path tốt nhất xác định đúng hai đại lượng của American Express và phép chia cần thực hiện.</w:t>
+      </w:r>
+    </w:p>
+    <w:p>
+      <w:pPr>
+        <w:pStyle w:val="Compact"/>
+        <w:numPr>
+          <w:numId w:val="1008"/>
+          <w:ilvl w:val="0"/>
+        </w:numPr>
+      </w:pPr>
+      <w:r>
+        <w:rPr>
+          <w:b/>
+        </w:rPr>
+        <w:t xml:space="preserve">Execution:</w:t>
+      </w:r>
+      <w:r>
+        <w:t xml:space="preserve"> </w:t>
+      </w:r>
+      <w:r>
+        <w:t xml:space="preserve">path lấy</w:t>
+      </w:r>
+      <w:r>
+        <w:t xml:space="preserve"> </w:t>
+      </w:r>
+      <w:r>
+        <w:rPr>
+          <w:rStyle w:val="VerbatimChar"/>
+        </w:rPr>
+        <w:t xml:space="preserve">637</w:t>
+      </w:r>
+      <w:r>
+        <w:t xml:space="preserve"> </w:t>
+      </w:r>
+      <w:r>
+        <w:t xml:space="preserve">từ edge payment volume, lấy</w:t>
+      </w:r>
+      <w:r>
+        <w:t xml:space="preserve"> </w:t>
+      </w:r>
+      <w:r>
+        <w:rPr>
+          <w:rStyle w:val="VerbatimChar"/>
+        </w:rPr>
+        <w:t xml:space="preserve">5.0</w:t>
+      </w:r>
+      <w:r>
+        <w:t xml:space="preserve"> </w:t>
+      </w:r>
+      <w:r>
+        <w:t xml:space="preserve">từ edge total transactions, chuyển hai giá trị về số và tính</w:t>
+      </w:r>
+      <w:r>
+        <w:t xml:space="preserve"> </w:t>
+      </w:r>
+      <w:r>
+        <w:rPr>
+          <w:rStyle w:val="VerbatimChar"/>
+        </w:rPr>
+        <w:t xml:space="preserve">637 / 5.0</w:t>
+      </w:r>
+      <w:r>
+        <w:t xml:space="preserve">.</w:t>
+      </w:r>
+    </w:p>
+    <w:p>
+      <w:pPr>
+        <w:pStyle w:val="Compact"/>
+        <w:numPr>
+          <w:numId w:val="1008"/>
+          <w:ilvl w:val="0"/>
+        </w:numPr>
+      </w:pPr>
+      <w:r>
+        <w:rPr>
+          <w:b/>
+        </w:rPr>
+        <w:t xml:space="preserve">Grounded evaluation:</w:t>
+      </w:r>
+      <w:r>
+        <w:t xml:space="preserve"> </w:t>
+      </w:r>
+      <w:r>
+        <w:t xml:space="preserve">path có evidence từ các edge đã truy cập, không trả rỗng và được chọn với score</w:t>
+      </w:r>
+      <w:r>
+        <w:t xml:space="preserve"> </w:t>
+      </w:r>
+      <w:r>
+        <w:rPr>
+          <w:rStyle w:val="VerbatimChar"/>
+        </w:rPr>
+        <w:t xml:space="preserve">3.75</w:t>
+      </w:r>
+      <w:r>
+        <w:t xml:space="preserve">.</w:t>
+      </w:r>
+    </w:p>
+    <w:p>
+      <w:pPr>
+        <w:pStyle w:val="Compact"/>
+        <w:numPr>
+          <w:numId w:val="1008"/>
+          <w:ilvl w:val="0"/>
+        </w:numPr>
+      </w:pPr>
+      <w:r>
+        <w:rPr>
+          <w:b/>
+        </w:rPr>
+        <w:t xml:space="preserve">Answer synthesis:</w:t>
+      </w:r>
+      <w:r>
+        <w:t xml:space="preserve"> </w:t>
+      </w:r>
+      <w:r>
+        <w:t xml:space="preserve">hệ thống trả:</w:t>
+      </w:r>
+      <w:r>
+        <w:t xml:space="preserve"> </w:t>
+      </w:r>
+      <w:r>
+        <w:t xml:space="preserve">“</w:t>
+      </w:r>
+      <w:r>
+        <w:t xml:space="preserve">The average payment volume per transaction for American Express is 127.4.</w:t>
+      </w:r>
+      <w:r>
+        <w:t xml:space="preserve">”</w:t>
+      </w:r>
+    </w:p>
+    <w:p>
+      <w:pPr>
+        <w:pStyle w:val="Heading3"/>
+      </w:pPr>
+      <w:bookmarkStart w:id="59" w:name="online-kg-đã-tạo-1"/>
+      <w:r>
+        <w:t xml:space="preserve">Online KG đã tạo</w:t>
+      </w:r>
+      <w:bookmarkEnd w:id="59"/>
+    </w:p>
+    <w:p>
+      <w:pPr>
+        <w:pStyle w:val="FirstParagraph"/>
+      </w:pPr>
+      <w:r>
+        <w:t xml:space="preserve">Subgraph trực tiếp phục vụ câu hỏi:</w:t>
+      </w:r>
+    </w:p>
+    <w:p>
+      <w:pPr>
+        <w:pStyle w:val="CaptionedFigure"/>
+      </w:pPr>
+      <w:r>
+        <w:drawing>
+          <wp:inline>
+            <wp:extent cx="5334000" cy="1833742"/>
+            <wp:effectExtent b="0" l="0" r="0" t="0"/>
+            <wp:docPr descr="Online KG của case FinQA American Express" title="" id="1" name="Picture"/>
+            <a:graphic>
+              <a:graphicData uri="http://schemas.openxmlformats.org/drawingml/2006/picture">
+                <pic:pic>
+                  <pic:nvPicPr>
+                    <pic:cNvPr descr="figures/finqa_american_express_kg.png" id="0" name="Picture"/>
+                    <pic:cNvPicPr>
+                      <a:picLocks noChangeArrowheads="1" noChangeAspect="1"/>
+                    </pic:cNvPicPr>
+                  </pic:nvPicPr>
+                  <pic:blipFill>
+                    <a:blip r:embed="rId60"/>
+                    <a:stretch>
+                      <a:fillRect/>
+                    </a:stretch>
+                  </pic:blipFill>
+                  <pic:spPr bwMode="auto">
+                    <a:xfrm>
+                      <a:off x="0" y="0"/>
+                      <a:ext cx="5334000" cy="1833742"/>
+                    </a:xfrm>
+                    <a:prstGeom prst="rect">
+                      <a:avLst/>
+                    </a:prstGeom>
+                    <a:noFill/>
+                    <a:ln w="9525">
+                      <a:noFill/>
+                      <a:headEnd/>
+                      <a:tailEnd/>
+                    </a:ln>
+                  </pic:spPr>
+                </pic:pic>
+              </a:graphicData>
+            </a:graphic>
+          </wp:inline>
+        </w:drawing>
+      </w:r>
+    </w:p>
+    <w:p>
+      <w:pPr>
+        <w:pStyle w:val="ImageCaption"/>
+      </w:pPr>
+      <w:r>
+        <w:t xml:space="preserve">Online KG của case FinQA American Express</w:t>
+      </w:r>
+    </w:p>
+    <w:p>
+      <w:pPr>
+        <w:pStyle w:val="SourceCode"/>
+      </w:pPr>
+      <w:r>
+        <w:rPr>
+          <w:rStyle w:val="VerbatimChar"/>
+        </w:rPr>
+        <w:t xml:space="preserve">                              +--payments_volume_billions----&gt; 637</w:t>
+      </w:r>
+      <w:r>
+        <w:br w:type="textWrapping"/>
+      </w:r>
+      <w:r>
+        <w:rPr>
+          <w:rStyle w:val="VerbatimChar"/>
+        </w:rPr>
+        <w:t xml:space="preserve">                              |</w:t>
+      </w:r>
+      <w:r>
+        <w:br w:type="textWrapping"/>
+      </w:r>
+      <w:r>
+        <w:rPr>
+          <w:rStyle w:val="VerbatimChar"/>
+        </w:rPr>
+        <w:t xml:space="preserve">American Express -------------+--total_transactions_billions-&gt; 5.0</w:t>
+      </w:r>
+      <w:r>
+        <w:br w:type="textWrapping"/>
+      </w:r>
+      <w:r>
+        <w:rPr>
+          <w:rStyle w:val="VerbatimChar"/>
+        </w:rPr>
+        <w:t xml:space="preserve">                              |</w:t>
+      </w:r>
+      <w:r>
+        <w:br w:type="textWrapping"/>
+      </w:r>
+      <w:r>
+        <w:rPr>
+          <w:rStyle w:val="VerbatimChar"/>
+        </w:rPr>
+        <w:t xml:space="preserve">                              +--total_volume_billions-------&gt; 647</w:t>
+      </w:r>
+      <w:r>
+        <w:br w:type="textWrapping"/>
+      </w:r>
+      <w:r>
+        <w:rPr>
+          <w:rStyle w:val="VerbatimChar"/>
+        </w:rPr>
+        <w:t xml:space="preserve">                              |</w:t>
+      </w:r>
+      <w:r>
+        <w:br w:type="textWrapping"/>
+      </w:r>
+      <w:r>
+        <w:rPr>
+          <w:rStyle w:val="VerbatimChar"/>
+        </w:rPr>
+        <w:t xml:space="preserve">                              +--cards_millions--------------&gt; 86</w:t>
+      </w:r>
+    </w:p>
+    <w:p>
+      <w:pPr>
+        <w:pStyle w:val="FirstParagraph"/>
+      </w:pPr>
+      <w:r>
+        <w:t xml:space="preserve">Các triple cốt lõi:</w:t>
+      </w:r>
+    </w:p>
+    <w:tbl>
+      <w:tblPr>
+        <w:tblStyle w:val="Table"/>
+        <w:tblW w:type="pct" w:w="0.0"/>
+        <w:tblLook w:firstRow="1"/>
+      </w:tblPr>
+      <w:tblGrid/>
+      <w:tr>
+        <w:trPr>
+          <w:cnfStyle w:firstRow="1"/>
+        </w:trPr>
+        <w:tc>
+          <w:tcPr>
+            <w:tcBorders>
+              <w:bottom w:val="single"/>
+            </w:tcBorders>
+            <w:vAlign w:val="bottom"/>
+          </w:tcPr>
+          <w:p>
+            <w:pPr>
+              <w:pStyle w:val="Compact"/>
+              <w:jc w:val="left"/>
+            </w:pPr>
+            <w:r>
+              <w:t xml:space="preserve">Head</w:t>
+            </w:r>
+          </w:p>
+        </w:tc>
+        <w:tc>
+          <w:tcPr>
+            <w:tcBorders>
+              <w:bottom w:val="single"/>
+            </w:tcBorders>
+            <w:vAlign w:val="bottom"/>
+          </w:tcPr>
+          <w:p>
+            <w:pPr>
+              <w:pStyle w:val="Compact"/>
+              <w:jc w:val="left"/>
+            </w:pPr>
+            <w:r>
+              <w:t xml:space="preserve">Relation</w:t>
+            </w:r>
+          </w:p>
+        </w:tc>
+        <w:tc>
+          <w:tcPr>
+            <w:tcBorders>
+              <w:bottom w:val="single"/>
+            </w:tcBorders>
+            <w:vAlign w:val="bottom"/>
+          </w:tcPr>
+          <w:p>
+            <w:pPr>
+              <w:pStyle w:val="Compact"/>
+              <w:jc w:val="left"/>
+            </w:pPr>
+            <w:r>
+              <w:t xml:space="preserve">Tail</w:t>
+            </w:r>
+          </w:p>
+        </w:tc>
+        <w:tc>
+          <w:tcPr>
+            <w:tcBorders>
+              <w:bottom w:val="single"/>
+            </w:tcBorders>
+            <w:vAlign w:val="bottom"/>
+          </w:tcPr>
+          <w:p>
+            <w:pPr>
+              <w:pStyle w:val="Compact"/>
+              <w:jc w:val="left"/>
+            </w:pPr>
+            <w:r>
+              <w:t xml:space="preserve">Nguồn</w:t>
+            </w:r>
+          </w:p>
+        </w:tc>
+      </w:tr>
+      <w:tr>
+        <w:tc>
+          <w:p>
+            <w:pPr>
+              <w:pStyle w:val="Compact"/>
+              <w:jc w:val="left"/>
+            </w:pPr>
+            <w:r>
+              <w:t xml:space="preserve">American Express</w:t>
+            </w:r>
+          </w:p>
+        </w:tc>
+        <w:tc>
+          <w:p>
+            <w:pPr>
+              <w:pStyle w:val="Compact"/>
+              <w:jc w:val="left"/>
+            </w:pPr>
+            <w:r>
+              <w:t xml:space="preserve">payments_volume_billions</w:t>
+            </w:r>
+          </w:p>
+        </w:tc>
+        <w:tc>
+          <w:p>
+            <w:pPr>
+              <w:pStyle w:val="Compact"/>
+              <w:jc w:val="left"/>
+            </w:pPr>
+            <w:r>
+              <w:t xml:space="preserve">637</w:t>
+            </w:r>
+          </w:p>
+        </w:tc>
+        <w:tc>
+          <w:p>
+            <w:pPr>
+              <w:pStyle w:val="Compact"/>
+              <w:jc w:val="left"/>
+            </w:pPr>
+            <w:r>
+              <w:t xml:space="preserve">Table</w:t>
+            </w:r>
+          </w:p>
+        </w:tc>
+      </w:tr>
+      <w:tr>
+        <w:tc>
+          <w:p>
+            <w:pPr>
+              <w:pStyle w:val="Compact"/>
+              <w:jc w:val="left"/>
+            </w:pPr>
+            <w:r>
+              <w:t xml:space="preserve">American Express</w:t>
+            </w:r>
+          </w:p>
+        </w:tc>
+        <w:tc>
+          <w:p>
+            <w:pPr>
+              <w:pStyle w:val="Compact"/>
+              <w:jc w:val="left"/>
+            </w:pPr>
+            <w:r>
+              <w:t xml:space="preserve">total_transactions_billions</w:t>
+            </w:r>
+          </w:p>
+        </w:tc>
+        <w:tc>
+          <w:p>
+            <w:pPr>
+              <w:pStyle w:val="Compact"/>
+              <w:jc w:val="left"/>
+            </w:pPr>
+            <w:r>
+              <w:t xml:space="preserve">5.0</w:t>
+            </w:r>
+          </w:p>
+        </w:tc>
+        <w:tc>
+          <w:p>
+            <w:pPr>
+              <w:pStyle w:val="Compact"/>
+              <w:jc w:val="left"/>
+            </w:pPr>
+            <w:r>
+              <w:t xml:space="preserve">Table</w:t>
+            </w:r>
+          </w:p>
+        </w:tc>
+      </w:tr>
+      <w:tr>
+        <w:tc>
+          <w:p>
+            <w:pPr>
+              <w:pStyle w:val="Compact"/>
+              <w:jc w:val="left"/>
+            </w:pPr>
+            <w:r>
+              <w:t xml:space="preserve">American Express</w:t>
+            </w:r>
+          </w:p>
+        </w:tc>
+        <w:tc>
+          <w:p>
+            <w:pPr>
+              <w:pStyle w:val="Compact"/>
+              <w:jc w:val="left"/>
+            </w:pPr>
+            <w:r>
+              <w:t xml:space="preserve">total_volume_billions</w:t>
+            </w:r>
+          </w:p>
+        </w:tc>
+        <w:tc>
+          <w:p>
+            <w:pPr>
+              <w:pStyle w:val="Compact"/>
+              <w:jc w:val="left"/>
+            </w:pPr>
+            <w:r>
+              <w:t xml:space="preserve">647</w:t>
+            </w:r>
+          </w:p>
+        </w:tc>
+        <w:tc>
+          <w:p>
+            <w:pPr>
+              <w:pStyle w:val="Compact"/>
+              <w:jc w:val="left"/>
+            </w:pPr>
+            <w:r>
+              <w:t xml:space="preserve">Table</w:t>
+            </w:r>
+          </w:p>
+        </w:tc>
+      </w:tr>
+      <w:tr>
+        <w:tc>
+          <w:p>
+            <w:pPr>
+              <w:pStyle w:val="Compact"/>
+              <w:jc w:val="left"/>
+            </w:pPr>
+            <w:r>
+              <w:t xml:space="preserve">American Express</w:t>
+            </w:r>
+          </w:p>
+        </w:tc>
+        <w:tc>
+          <w:p>
+            <w:pPr>
+              <w:pStyle w:val="Compact"/>
+              <w:jc w:val="left"/>
+            </w:pPr>
+            <w:r>
+              <w:t xml:space="preserve">cards_millions</w:t>
+            </w:r>
+          </w:p>
+        </w:tc>
+        <w:tc>
+          <w:p>
+            <w:pPr>
+              <w:pStyle w:val="Compact"/>
+              <w:jc w:val="left"/>
+            </w:pPr>
+            <w:r>
+              <w:t xml:space="preserve">86</w:t>
+            </w:r>
+          </w:p>
+        </w:tc>
+        <w:tc>
+          <w:p>
+            <w:pPr>
+              <w:pStyle w:val="Compact"/>
+              <w:jc w:val="left"/>
+            </w:pPr>
+            <w:r>
+              <w:t xml:space="preserve">Table</w:t>
+            </w:r>
+          </w:p>
+        </w:tc>
+      </w:tr>
+    </w:tbl>
+    <w:p>
+      <w:pPr>
+        <w:pStyle w:val="BodyText"/>
+      </w:pPr>
+      <w:r>
+        <w:t xml:space="preserve">Reasoning path được chọn:</w:t>
+      </w:r>
+    </w:p>
+    <w:p>
+      <w:pPr>
+        <w:pStyle w:val="SourceCode"/>
+      </w:pPr>
+      <w:r>
+        <w:rPr>
+          <w:rStyle w:val="VerbatimChar"/>
+        </w:rPr>
+        <w:t xml:space="preserve">American Express</w:t>
+      </w:r>
+      <w:r>
+        <w:br w:type="textWrapping"/>
+      </w:r>
+      <w:r>
+        <w:rPr>
+          <w:rStyle w:val="VerbatimChar"/>
+        </w:rPr>
+        <w:t xml:space="preserve">    ├─ payments_volume_billions → 637</w:t>
+      </w:r>
+      <w:r>
+        <w:br w:type="textWrapping"/>
+      </w:r>
+      <w:r>
+        <w:rPr>
+          <w:rStyle w:val="VerbatimChar"/>
+        </w:rPr>
+        <w:t xml:space="preserve">    └─ total_transactions_billions → 5.0</w:t>
+      </w:r>
+      <w:r>
+        <w:br w:type="textWrapping"/>
+      </w:r>
+      <w:r>
+        <w:br w:type="textWrapping"/>
+      </w:r>
+      <w:r>
+        <w:rPr>
+          <w:rStyle w:val="VerbatimChar"/>
+        </w:rPr>
+        <w:t xml:space="preserve">637 ÷ 5.0 → 127.4</w:t>
+      </w:r>
+    </w:p>
+    <w:p>
+      <w:pPr>
+        <w:pStyle w:val="Heading3"/>
+      </w:pPr>
+      <w:bookmarkStart w:id="61" w:name="đánh-giá-kết-quả"/>
+      <w:r>
+        <w:t xml:space="preserve">Đánh giá kết quả</w:t>
+      </w:r>
+      <w:bookmarkEnd w:id="61"/>
+    </w:p>
+    <w:tbl>
+      <w:tblPr>
+        <w:tblStyle w:val="Table"/>
+        <w:tblW w:type="pct" w:w="0.0"/>
+        <w:tblLook w:firstRow="1"/>
+      </w:tblPr>
+      <w:tblGrid/>
+      <w:tr>
+        <w:trPr>
+          <w:cnfStyle w:firstRow="1"/>
+        </w:trPr>
+        <w:tc>
+          <w:tcPr>
+            <w:tcBorders>
+              <w:bottom w:val="single"/>
+            </w:tcBorders>
+            <w:vAlign w:val="bottom"/>
+          </w:tcPr>
+          <w:p>
+            <w:pPr>
+              <w:pStyle w:val="Compact"/>
+              <w:jc w:val="left"/>
+            </w:pPr>
+            <w:r>
+              <w:t xml:space="preserve">Tiêu chí</w:t>
+            </w:r>
+          </w:p>
+        </w:tc>
+        <w:tc>
+          <w:tcPr>
+            <w:tcBorders>
+              <w:bottom w:val="single"/>
+            </w:tcBorders>
+            <w:vAlign w:val="bottom"/>
+          </w:tcPr>
+          <w:p>
+            <w:pPr>
+              <w:pStyle w:val="Compact"/>
+              <w:jc w:val="left"/>
+            </w:pPr>
+            <w:r>
+              <w:t xml:space="preserve">Kết quả</w:t>
+            </w:r>
+          </w:p>
+        </w:tc>
+      </w:tr>
+      <w:tr>
+        <w:tc>
+          <w:p>
+            <w:pPr>
+              <w:pStyle w:val="Compact"/>
+              <w:jc w:val="left"/>
+            </w:pPr>
+            <w:r>
+              <w:t xml:space="preserve">Gold numeric answer</w:t>
+            </w:r>
+          </w:p>
+        </w:tc>
+        <w:tc>
+          <w:p>
+            <w:pPr>
+              <w:pStyle w:val="Compact"/>
+              <w:jc w:val="left"/>
+            </w:pPr>
+            <w:r>
+              <w:t xml:space="preserve">127.4</w:t>
+            </w:r>
+          </w:p>
+        </w:tc>
+      </w:tr>
+      <w:tr>
+        <w:tc>
+          <w:p>
+            <w:pPr>
+              <w:pStyle w:val="Compact"/>
+              <w:jc w:val="left"/>
+            </w:pPr>
+            <w:r>
+              <w:t xml:space="preserve">Executed value</w:t>
+            </w:r>
+          </w:p>
+        </w:tc>
+        <w:tc>
+          <w:p>
+            <w:pPr>
+              <w:pStyle w:val="Compact"/>
+              <w:jc w:val="left"/>
+            </w:pPr>
+            <w:r>
+              <w:t xml:space="preserve">127.4</w:t>
+            </w:r>
+          </w:p>
+        </w:tc>
+      </w:tr>
+      <w:tr>
+        <w:tc>
+          <w:p>
+            <w:pPr>
+              <w:pStyle w:val="Compact"/>
+              <w:jc w:val="left"/>
+            </w:pPr>
+            <w:r>
+              <w:t xml:space="preserve">Sai số tuyệt đối</w:t>
+            </w:r>
+          </w:p>
+        </w:tc>
+        <w:tc>
+          <w:p>
+            <w:pPr>
+              <w:pStyle w:val="Compact"/>
+              <w:jc w:val="left"/>
+            </w:pPr>
+            <w:r>
+              <w:t xml:space="preserve">0.0</w:t>
+            </w:r>
+          </w:p>
+        </w:tc>
+      </w:tr>
+      <w:tr>
+        <w:tc>
+          <w:p>
+            <w:pPr>
+              <w:pStyle w:val="Compact"/>
+              <w:jc w:val="left"/>
+            </w:pPr>
+            <w:r>
+              <w:t xml:space="preserve">Execution correctness</w:t>
+            </w:r>
+          </w:p>
+        </w:tc>
+        <w:tc>
+          <w:p>
+            <w:pPr>
+              <w:pStyle w:val="Compact"/>
+              <w:jc w:val="left"/>
+            </w:pPr>
+            <w:r>
+              <w:t xml:space="preserve">Đúng</w:t>
+            </w:r>
+          </w:p>
+        </w:tc>
+      </w:tr>
+      <w:tr>
+        <w:tc>
+          <w:p>
+            <w:pPr>
+              <w:pStyle w:val="Compact"/>
+              <w:jc w:val="left"/>
+            </w:pPr>
+            <w:r>
+              <w:t xml:space="preserve">Replan</w:t>
+            </w:r>
+          </w:p>
+        </w:tc>
+        <w:tc>
+          <w:p>
+            <w:pPr>
+              <w:pStyle w:val="Compact"/>
+              <w:jc w:val="left"/>
+            </w:pPr>
+            <w:r>
+              <w:t xml:space="preserve">Không (</w:t>
+            </w:r>
+            <w:r>
+              <w:rPr>
+                <w:rStyle w:val="VerbatimChar"/>
+              </w:rPr>
+              <w:t xml:space="preserve">0</w:t>
+            </w:r>
+            <w:r>
+              <w:t xml:space="preserve">)</w:t>
+            </w:r>
+          </w:p>
+        </w:tc>
+      </w:tr>
+      <w:tr>
+        <w:tc>
+          <w:p>
+            <w:pPr>
+              <w:pStyle w:val="Compact"/>
+              <w:jc w:val="left"/>
+            </w:pPr>
+            <w:r>
+              <w:t xml:space="preserve">Best path</w:t>
+            </w:r>
+          </w:p>
+        </w:tc>
+        <w:tc>
+          <w:p>
+            <w:pPr>
+              <w:pStyle w:val="Compact"/>
+              <w:jc w:val="left"/>
+            </w:pPr>
+            <w:r>
+              <w:rPr>
+                <w:rStyle w:val="VerbatimChar"/>
+              </w:rPr>
+              <w:t xml:space="preserve">path_1</w:t>
+            </w:r>
+          </w:p>
+        </w:tc>
+      </w:tr>
+      <w:tr>
+        <w:tc>
+          <w:p>
+            <w:pPr>
+              <w:pStyle w:val="Compact"/>
+              <w:jc w:val="left"/>
+            </w:pPr>
+            <w:r>
+              <w:t xml:space="preserve">Best grounded score</w:t>
+            </w:r>
+          </w:p>
+        </w:tc>
+        <w:tc>
+          <w:p>
+            <w:pPr>
+              <w:pStyle w:val="Compact"/>
+              <w:jc w:val="left"/>
+            </w:pPr>
+            <w:r>
+              <w:t xml:space="preserve">3.75</w:t>
+            </w:r>
+          </w:p>
+        </w:tc>
+      </w:tr>
+    </w:tbl>
+    <w:p>
+      <w:pPr>
+        <w:pStyle w:val="BodyText"/>
+      </w:pPr>
+      <w:r>
+        <w:t xml:space="preserve">Về ngữ nghĩa và execution, kết quả trùng hoàn toàn với gold. Tuy nhiên, answer cuối hiện là một câu tự nhiên thay vì chuỗi số thuần. Trước khi chạy evaluator chính thức của FinQA trên toàn bộ tập dữ liệu, cần bổ sung bước lấy numeric answer (</w:t>
+      </w:r>
+      <w:r>
+        <w:rPr>
+          <w:rStyle w:val="VerbatimChar"/>
+        </w:rPr>
+        <w:t xml:space="preserve">127.4</w:t>
+      </w:r>
+      <w:r>
+        <w:t xml:space="preserve">) từ câu trả lời hoặc cho Answer Synthesizer trả thêm một trường</w:t>
+      </w:r>
+      <w:r>
+        <w:t xml:space="preserve"> </w:t>
+      </w:r>
+      <w:r>
+        <w:rPr>
+          <w:rStyle w:val="VerbatimChar"/>
+        </w:rPr>
+        <w:t xml:space="preserve">answer_value</w:t>
+      </w:r>
+      <w:r>
+        <w:t xml:space="preserve"> </w:t>
+      </w:r>
+      <w:r>
+        <w:t xml:space="preserve">có cấu trúc.</w:t>
+      </w:r>
+    </w:p>
+    <w:p>
+      <w:pPr>
+        <w:pStyle w:val="Heading2"/>
+      </w:pPr>
+      <w:bookmarkStart w:id="62" w:name="tổng-hợp"/>
+      <w:r>
+        <w:t xml:space="preserve">2.5. Tổng hợp</w:t>
+      </w:r>
+      <w:bookmarkEnd w:id="62"/>
     </w:p>
     <w:tbl>
       <w:tblPr>
@@ -3701,23 +6127,69 @@
           </w:p>
         </w:tc>
       </w:tr>
+      <w:tr>
+        <w:tc>
+          <w:p>
+            <w:pPr>
+              <w:pStyle w:val="Compact"/>
+              <w:jc w:val="left"/>
+            </w:pPr>
+            <w:r>
+              <w:t xml:space="preserve">American Express</w:t>
+            </w:r>
+          </w:p>
+        </w:tc>
+        <w:tc>
+          <w:p>
+            <w:pPr>
+              <w:pStyle w:val="Compact"/>
+              <w:jc w:val="left"/>
+            </w:pPr>
+            <w:r>
+              <w:t xml:space="preserve">Chọn hàng/cột → chia hai đại lượng</w:t>
+            </w:r>
+          </w:p>
+        </w:tc>
+        <w:tc>
+          <w:p>
+            <w:pPr>
+              <w:pStyle w:val="Compact"/>
+              <w:jc w:val="left"/>
+            </w:pPr>
+            <w:r>
+              <w:t xml:space="preserve">FinQA Table</w:t>
+            </w:r>
+          </w:p>
+        </w:tc>
+        <w:tc>
+          <w:p>
+            <w:pPr>
+              <w:pStyle w:val="Compact"/>
+              <w:jc w:val="left"/>
+            </w:pPr>
+            <w:r>
+              <w:t xml:space="preserve">Full pipeline thực thi đúng 637 ÷ 5 = 127.4</w:t>
+            </w:r>
+          </w:p>
+        </w:tc>
+      </w:tr>
     </w:tbl>
     <w:p>
       <w:pPr>
         <w:pStyle w:val="Heading1"/>
       </w:pPr>
-      <w:bookmarkStart w:id="51" w:name="kết-luận"/>
+      <w:bookmarkStart w:id="63" w:name="kết-luận"/>
       <w:r>
         <w:t xml:space="preserve">3. Kết luận</w:t>
       </w:r>
-      <w:bookmarkEnd w:id="51"/>
+      <w:bookmarkEnd w:id="63"/>
     </w:p>
     <w:p>
       <w:pPr>
         <w:pStyle w:val="FirstParagraph"/>
       </w:pPr>
       <w:r>
-        <w:t xml:space="preserve">Pipeline hiện đã bao phủ đầy đủ retrieval, trích xuất tri thức, chuẩn hóa, dựng Online KG, sinh và thực thi reasoning paths, chấm điểm theo evidence và sinh answer.</w:t>
+        <w:t xml:space="preserve">Pipeline hiện đã bao phủ đầy đủ retrieval, trích xuất tri thức, chuẩn hóa, dựng Online KG, sinh reasoning paths, sinh code truy vấn cho từng path, kiểm tra code, thực thi trong sandbox có trace provenance, chấm điểm theo evidence và sinh answer.</w:t>
       </w:r>
     </w:p>
     <w:p>
@@ -3725,7 +6197,15 @@
         <w:pStyle w:val="BodyText"/>
       </w:pPr>
       <w:r>
-        <w:t xml:space="preserve">Ví dụ Karim Bencherifa cho thấy hệ thống nối được ngày sinh trong text với nationality trong table qua entity chung. Ví dụ Walter Payton cho thấy retrieval một lượt có thể thất bại và lý do cần reasoning có điều kiện theo entity. Ví dụ Cerro Porteño minh họa vai trò của chuẩn hóa entity khi nối facts từ nhiều nguồn.</w:t>
+        <w:t xml:space="preserve">Phần sinh code là cơ chế biến reasoning path thành một phép kiểm chứng có thể chạy được. Nhờ code generator và sandbox, hệ thống không chấp nhận một path chỉ vì mô tả của LLM nghe hợp lý: path phải truy cập được KG, trả kết quả và để lại evidence để evaluator kiểm tra. Các lỗi cú pháp, lỗi API, sai hướng cạnh, hard-code, lỗi runtime và timeout đều được ghi nhận ở cấp path, cho phép loại path hoặc replanning mà không làm hỏng toàn bộ câu hỏi.</w:t>
+      </w:r>
+    </w:p>
+    <w:p>
+      <w:pPr>
+        <w:pStyle w:val="BodyText"/>
+      </w:pPr>
+      <w:r>
+        <w:t xml:space="preserve">Ví dụ Karim Bencherifa cho thấy hệ thống nối được ngày sinh trong text với nationality trong table qua entity chung. Ví dụ Walter Payton cho thấy retrieval một lượt có thể thất bại và lý do cần reasoning có điều kiện theo entity. Ví dụ Cerro Porteño minh họa vai trò của chuẩn hóa entity khi nối facts từ nhiều nguồn. Case American Express cho thấy pipeline cũng thực hiện đúng một phép toán FinQA dựa trên hai fact được lấy từ bảng.</w:t>
       </w:r>
     </w:p>
     <w:p>
@@ -4197,9 +6677,6 @@
     <w:abstractNumId w:val="991"/>
   </w:num>
   <w:num w:numId="1002">
-    <w:abstractNumId w:val="991"/>
-  </w:num>
-  <w:num w:numId="1003">
     <w:abstractNumId w:val="99411"/>
     <w:lvlOverride w:ilvl="0">
       <w:startOverride w:val="1"/>
@@ -4229,7 +6706,13 @@
       <w:startOverride w:val="1"/>
     </w:lvlOverride>
   </w:num>
+  <w:num w:numId="1003">
+    <w:abstractNumId w:val="991"/>
+  </w:num>
   <w:num w:numId="1004">
+    <w:abstractNumId w:val="991"/>
+  </w:num>
+  <w:num w:numId="1005">
     <w:abstractNumId w:val="99411"/>
     <w:lvlOverride w:ilvl="0">
       <w:startOverride w:val="1"/>
@@ -4259,7 +6742,67 @@
       <w:startOverride w:val="1"/>
     </w:lvlOverride>
   </w:num>
-  <w:num w:numId="1005">
+  <w:num w:numId="1006">
+    <w:abstractNumId w:val="99411"/>
+    <w:lvlOverride w:ilvl="0">
+      <w:startOverride w:val="1"/>
+    </w:lvlOverride>
+    <w:lvlOverride w:ilvl="1">
+      <w:startOverride w:val="1"/>
+    </w:lvlOverride>
+    <w:lvlOverride w:ilvl="2">
+      <w:startOverride w:val="1"/>
+    </w:lvlOverride>
+    <w:lvlOverride w:ilvl="3">
+      <w:startOverride w:val="1"/>
+    </w:lvlOverride>
+    <w:lvlOverride w:ilvl="4">
+      <w:startOverride w:val="1"/>
+    </w:lvlOverride>
+    <w:lvlOverride w:ilvl="5">
+      <w:startOverride w:val="1"/>
+    </w:lvlOverride>
+    <w:lvlOverride w:ilvl="6">
+      <w:startOverride w:val="1"/>
+    </w:lvlOverride>
+    <w:lvlOverride w:ilvl="7">
+      <w:startOverride w:val="1"/>
+    </w:lvlOverride>
+    <w:lvlOverride w:ilvl="8">
+      <w:startOverride w:val="1"/>
+    </w:lvlOverride>
+  </w:num>
+  <w:num w:numId="1007">
+    <w:abstractNumId w:val="99411"/>
+    <w:lvlOverride w:ilvl="0">
+      <w:startOverride w:val="1"/>
+    </w:lvlOverride>
+    <w:lvlOverride w:ilvl="1">
+      <w:startOverride w:val="1"/>
+    </w:lvlOverride>
+    <w:lvlOverride w:ilvl="2">
+      <w:startOverride w:val="1"/>
+    </w:lvlOverride>
+    <w:lvlOverride w:ilvl="3">
+      <w:startOverride w:val="1"/>
+    </w:lvlOverride>
+    <w:lvlOverride w:ilvl="4">
+      <w:startOverride w:val="1"/>
+    </w:lvlOverride>
+    <w:lvlOverride w:ilvl="5">
+      <w:startOverride w:val="1"/>
+    </w:lvlOverride>
+    <w:lvlOverride w:ilvl="6">
+      <w:startOverride w:val="1"/>
+    </w:lvlOverride>
+    <w:lvlOverride w:ilvl="7">
+      <w:startOverride w:val="1"/>
+    </w:lvlOverride>
+    <w:lvlOverride w:ilvl="8">
+      <w:startOverride w:val="1"/>
+    </w:lvlOverride>
+  </w:num>
+  <w:num w:numId="1008">
     <w:abstractNumId w:val="99411"/>
     <w:lvlOverride w:ilvl="0">
       <w:startOverride w:val="1"/>

</xml_diff>